<commit_message>
Expand guidebook chapter 7 with code-vs-mail visual comparisons
- Rewrite HTML body chapter in beginner-friendly steps (tags, values, links, conditions, mistakes)
- Add 8 side-by-side images generated by tools/make_compare.js using the real Main.gs and templates
- Include real mail_svc_tag.html vs rendered mail comparison

Co-Authored-By: Claude Sonnet 5.5 <noreply@anthropic.com>
Claude-Session: https://claude.ai/code/session_01WaTDqegUpUvcvj8f7a1CUA
</commit_message>
<xml_diff>
--- a/periodic-mail/docs/정기메일_발송기_가이드북.docx
+++ b/periodic-mail/docs/정기메일_발송기_가이드북.docx
@@ -289,7 +289,7 @@
                 <w:sz w:val="19"/>
                 <w:rFonts w:ascii="맑은 고딕" w:hAnsi="맑은 고딕" w:eastAsia="맑은 고딕"/>
               </w:rPr>
-              <w:t>메일이 안 간다 / 오류 메일이 왔다</w:t>
+              <w:t>HTML 본문을 처음 써 본다 (코드 ↔ 메일 비교)</w:t>
             </w:r>
           </w:p>
         </w:tc>
@@ -307,7 +307,7 @@
                 <w:sz w:val="19"/>
                 <w:rFonts w:ascii="맑은 고딕" w:hAnsi="맑은 고딕" w:eastAsia="맑은 고딕"/>
               </w:rPr>
-              <w:t>8장</w:t>
+              <w:t>7장</w:t>
             </w:r>
           </w:p>
         </w:tc>
@@ -328,7 +328,7 @@
                 <w:sz w:val="19"/>
                 <w:rFonts w:ascii="맑은 고딕" w:hAnsi="맑은 고딕" w:eastAsia="맑은 고딕"/>
               </w:rPr>
-              <w:t>자주 쓰는 것만 빠르게 보고 싶다</w:t>
+              <w:t>메일이 안 간다 / 오류 메일이 왔다</w:t>
             </w:r>
           </w:p>
         </w:tc>
@@ -336,6 +336,44 @@
           <w:tcPr>
             <w:tcW w:type="dxa" w:w="4535"/>
             <w:shd w:val="clear" w:color="auto" w:fill="F2F5F8"/>
+          </w:tcPr>
+          <w:p>
+            <w:pPr>
+              <w:spacing w:before="40" w:after="40" w:line="312" w:lineRule="auto"/>
+            </w:pPr>
+            <w:r/>
+            <w:r>
+              <w:rPr>
+                <w:sz w:val="19"/>
+                <w:rFonts w:ascii="맑은 고딕" w:hAnsi="맑은 고딕" w:eastAsia="맑은 고딕"/>
+              </w:rPr>
+              <w:t>8장</w:t>
+            </w:r>
+          </w:p>
+        </w:tc>
+      </w:tr>
+      <w:tr>
+        <w:tc>
+          <w:tcPr>
+            <w:tcW w:type="dxa" w:w="5102"/>
+          </w:tcPr>
+          <w:p>
+            <w:pPr>
+              <w:spacing w:before="40" w:after="40" w:line="312" w:lineRule="auto"/>
+            </w:pPr>
+            <w:r/>
+            <w:r>
+              <w:rPr>
+                <w:sz w:val="19"/>
+                <w:rFonts w:ascii="맑은 고딕" w:hAnsi="맑은 고딕" w:eastAsia="맑은 고딕"/>
+              </w:rPr>
+              <w:t>자주 쓰는 것만 빠르게 보고 싶다</w:t>
+            </w:r>
+          </w:p>
+        </w:tc>
+        <w:tc>
+          <w:tcPr>
+            <w:tcW w:type="dxa" w:w="4535"/>
           </w:tcPr>
           <w:p>
             <w:pPr>
@@ -10928,6 +10966,89 @@
     </w:p>
     <w:p>
       <w:pPr>
+        <w:spacing w:before="160" w:after="0" w:line="336" w:lineRule="auto"/>
+        <w:ind w:left="142" w:right="57"/>
+        <w:shd w:val="clear" w:color="auto" w:fill="EAF6EE"/>
+        <w:pBdr>
+          <w:left w:val="single" w:sz="20" w:space="6" w:color="15803D"/>
+        </w:pBdr>
+      </w:pPr>
+      <w:r>
+        <w:rPr>
+          <w:b/>
+          <w:color w:val="15803D"/>
+          <w:sz w:val="21"/>
+          <w:rFonts w:ascii="맑은 고딕" w:hAnsi="맑은 고딕" w:eastAsia="맑은 고딕"/>
+        </w:rPr>
+        <w:t xml:space="preserve">● </w:t>
+      </w:r>
+      <w:r>
+        <w:rPr>
+          <w:b/>
+          <w:color w:val="15803D"/>
+          <w:sz w:val="21"/>
+          <w:rFonts w:ascii="맑은 고딕" w:hAnsi="맑은 고딕" w:eastAsia="맑은 고딕"/>
+        </w:rPr>
+        <w:t xml:space="preserve">이 장을 읽는 법  </w:t>
+      </w:r>
+      <w:r>
+        <w:rPr>
+          <w:sz w:val="20"/>
+          <w:rFonts w:ascii="맑은 고딕" w:hAnsi="맑은 고딕" w:eastAsia="맑은 고딕"/>
+        </w:rPr>
+        <w:t>HTML 을 몰라도 괜찮습니다. 이 장의 예제를 복사해서 글자만 바꾸면 됩니다.</w:t>
+      </w:r>
+    </w:p>
+    <w:p>
+      <w:pPr>
+        <w:spacing w:before="0" w:after="0" w:line="336" w:lineRule="auto"/>
+        <w:ind w:left="142" w:right="57"/>
+        <w:shd w:val="clear" w:color="auto" w:fill="EAF6EE"/>
+        <w:pBdr>
+          <w:left w:val="single" w:sz="20" w:space="6" w:color="15803D"/>
+        </w:pBdr>
+      </w:pPr>
+      <w:r>
+        <w:rPr>
+          <w:sz w:val="21"/>
+          <w:rFonts w:ascii="맑은 고딕" w:hAnsi="맑은 고딕" w:eastAsia="맑은 고딕"/>
+        </w:rPr>
+        <w:t xml:space="preserve">   </w:t>
+      </w:r>
+      <w:r>
+        <w:rPr>
+          <w:sz w:val="20"/>
+          <w:rFonts w:ascii="맑은 고딕" w:hAnsi="맑은 고딕" w:eastAsia="맑은 고딕"/>
+        </w:rPr>
+        <w:t>모든 예제는 왼쪽에 “내가 쓴 코드”, 오른쪽에 “받는 사람이 보는 메일”을 나란히 보여 줍니다. 오른쪽 그림은 손으로 그린 것이 아니라 실제 발송기의 규칙으로 계산해서 만든 결과입니다.</w:t>
+      </w:r>
+    </w:p>
+    <w:p>
+      <w:pPr>
+        <w:spacing w:before="0" w:after="160" w:line="336" w:lineRule="auto"/>
+        <w:ind w:left="142" w:right="57"/>
+        <w:shd w:val="clear" w:color="auto" w:fill="EAF6EE"/>
+        <w:pBdr>
+          <w:left w:val="single" w:sz="20" w:space="6" w:color="15803D"/>
+        </w:pBdr>
+      </w:pPr>
+      <w:r>
+        <w:rPr>
+          <w:sz w:val="21"/>
+          <w:rFonts w:ascii="맑은 고딕" w:hAnsi="맑은 고딕" w:eastAsia="맑은 고딕"/>
+        </w:rPr>
+        <w:t xml:space="preserve">   </w:t>
+      </w:r>
+      <w:r>
+        <w:rPr>
+          <w:sz w:val="20"/>
+          <w:rFonts w:ascii="맑은 고딕" w:hAnsi="맑은 고딕" w:eastAsia="맑은 고딕"/>
+        </w:rPr>
+        <w:t>마지막에는 실제 파일(mail_svc_tag.html)과 실제로 발송되는 메일을 통째로 비교해 봅니다 (7-6).</w:t>
+      </w:r>
+    </w:p>
+    <w:p>
+      <w:pPr>
         <w:pStyle w:val="Heading2"/>
         <w:spacing w:before="280" w:after="100" w:line="312" w:lineRule="auto"/>
         <w:pBdr>
@@ -10941,7 +11062,7 @@
           <w:sz w:val="24"/>
           <w:rFonts w:ascii="맑은 고딕" w:hAnsi="맑은 고딕" w:eastAsia="맑은 고딕"/>
         </w:rPr>
-        <w:t>■ 7-1. 템플릿 문법 3가지</w:t>
+        <w:t>■ 7-1. HTML 이란? — 글자에 “꾸미는 지시문”을 붙이는 것</w:t>
       </w:r>
     </w:p>
     <w:p>
@@ -10950,7 +11071,1637 @@
           <w:sz w:val="21"/>
           <w:rFonts w:ascii="맑은 고딕" w:hAnsi="맑은 고딕" w:eastAsia="맑은 고딕"/>
         </w:rPr>
-        <w:t>HTML 파일 안에서 &lt;? ?&gt; 로 감싼 부분은 Apps Script 가 발송 직전에 실행해서 값으로 바꿉니다(스크립틀릿).</w:t>
+        <w:t xml:space="preserve">메일 본문은 그냥 글자가 아니라 </w:t>
+      </w:r>
+      <w:r>
+        <w:rPr>
+          <w:b/>
+          <w:sz w:val="21"/>
+          <w:rFonts w:ascii="맑은 고딕" w:hAnsi="맑은 고딕" w:eastAsia="맑은 고딕"/>
+        </w:rPr>
+        <w:t>글 + 꾸밈 지시문(태그)</w:t>
+      </w:r>
+      <w:r>
+        <w:rPr>
+          <w:sz w:val="21"/>
+          <w:rFonts w:ascii="맑은 고딕" w:hAnsi="맑은 고딕" w:eastAsia="맑은 고딕"/>
+        </w:rPr>
+        <w:t xml:space="preserve"> 으로 씁니다. 지시문은 꺾쇠 &lt; &gt; 로 감싸고, 글을 꾸밀 때는 </w:t>
+      </w:r>
+      <w:r>
+        <w:rPr>
+          <w:b/>
+          <w:sz w:val="21"/>
+          <w:rFonts w:ascii="맑은 고딕" w:hAnsi="맑은 고딕" w:eastAsia="맑은 고딕"/>
+        </w:rPr>
+        <w:t>열고 → 글 → 닫는</w:t>
+      </w:r>
+      <w:r>
+        <w:rPr>
+          <w:sz w:val="21"/>
+          <w:rFonts w:ascii="맑은 고딕" w:hAnsi="맑은 고딕" w:eastAsia="맑은 고딕"/>
+        </w:rPr>
+        <w:t xml:space="preserve"> 모양을 씁니다.</w:t>
+      </w:r>
+    </w:p>
+    <w:p>
+      <w:pPr>
+        <w:spacing w:before="160" w:after="20"/>
+      </w:pPr>
+      <w:r>
+        <w:rPr>
+          <w:b/>
+          <w:color w:val="6B7280"/>
+          <w:sz w:val="18"/>
+          <w:rFonts w:ascii="맑은 고딕" w:hAnsi="맑은 고딕" w:eastAsia="맑은 고딕"/>
+        </w:rPr>
+        <w:t>태그의 모양</w:t>
+      </w:r>
+    </w:p>
+    <w:p>
+      <w:pPr>
+        <w:spacing w:before="0" w:after="0" w:line="300" w:lineRule="auto"/>
+        <w:ind w:left="170"/>
+        <w:shd w:val="clear" w:color="auto" w:fill="F4F4F5"/>
+        <w:pBdr>
+          <w:left w:val="single" w:sz="12" w:space="6" w:color="C9D2DC"/>
+        </w:pBdr>
+      </w:pPr>
+      <w:r>
+        <w:rPr>
+          <w:sz w:val="19"/>
+          <w:rFonts w:ascii="Consolas" w:hAnsi="Consolas" w:eastAsia="Consolas"/>
+        </w:rPr>
+        <w:t>&lt;strong&gt;굵게 하고 싶은 글&lt;/strong&gt;</w:t>
+      </w:r>
+    </w:p>
+    <w:p>
+      <w:pPr>
+        <w:spacing w:before="0" w:after="120" w:line="300" w:lineRule="auto"/>
+        <w:ind w:left="170"/>
+        <w:shd w:val="clear" w:color="auto" w:fill="F4F4F5"/>
+        <w:pBdr>
+          <w:left w:val="single" w:sz="12" w:space="6" w:color="C9D2DC"/>
+        </w:pBdr>
+      </w:pPr>
+      <w:r>
+        <w:rPr>
+          <w:sz w:val="19"/>
+          <w:rFonts w:ascii="Consolas" w:hAnsi="Consolas" w:eastAsia="Consolas"/>
+        </w:rPr>
+        <w:t xml:space="preserve"> ↑ 여는 태그      ↑ 닫는 태그 (앞에 / 가 붙는다)</w:t>
+      </w:r>
+    </w:p>
+    <w:p>
+      <w:r>
+        <w:rPr>
+          <w:sz w:val="21"/>
+          <w:rFonts w:ascii="맑은 고딕" w:hAnsi="맑은 고딕" w:eastAsia="맑은 고딕"/>
+        </w:rPr>
+        <w:t>처음에는 아래 3가지만 기억하면 됩니다.</w:t>
+      </w:r>
+    </w:p>
+    <w:tbl>
+      <w:tblPr>
+        <w:tblStyle w:val="TableGrid"/>
+        <w:tblW w:type="auto" w:w="0"/>
+        <w:jc w:val="left"/>
+        <w:tblLayout w:type="fixed"/>
+        <w:tblLook w:firstColumn="1" w:firstRow="1" w:lastColumn="0" w:lastRow="0" w:noHBand="0" w:noVBand="1" w:val="04A0"/>
+        <w:tblLayout w:type="fixed"/>
+      </w:tblPr>
+      <w:tblGrid>
+        <w:gridCol w:w="4986"/>
+        <w:gridCol w:w="4986"/>
+      </w:tblGrid>
+      <w:tr>
+        <w:tc>
+          <w:tcPr>
+            <w:tcW w:type="dxa" w:w="2608"/>
+            <w:shd w:val="clear" w:color="auto" w:fill="1E3A5F"/>
+          </w:tcPr>
+          <w:p>
+            <w:pPr>
+              <w:spacing w:before="60" w:after="60" w:line="300" w:lineRule="auto"/>
+            </w:pPr>
+            <w:r/>
+            <w:r>
+              <w:rPr>
+                <w:b/>
+                <w:color w:val="FFFFFF"/>
+                <w:sz w:val="20"/>
+                <w:rFonts w:ascii="맑은 고딕" w:hAnsi="맑은 고딕" w:eastAsia="맑은 고딕"/>
+              </w:rPr>
+              <w:t>규칙</w:t>
+            </w:r>
+          </w:p>
+        </w:tc>
+        <w:tc>
+          <w:tcPr>
+            <w:tcW w:type="dxa" w:w="7030"/>
+            <w:shd w:val="clear" w:color="auto" w:fill="1E3A5F"/>
+          </w:tcPr>
+          <w:p>
+            <w:pPr>
+              <w:spacing w:before="60" w:after="60" w:line="300" w:lineRule="auto"/>
+            </w:pPr>
+            <w:r/>
+            <w:r>
+              <w:rPr>
+                <w:b/>
+                <w:color w:val="FFFFFF"/>
+                <w:sz w:val="20"/>
+                <w:rFonts w:ascii="맑은 고딕" w:hAnsi="맑은 고딕" w:eastAsia="맑은 고딕"/>
+              </w:rPr>
+              <w:t>설명</w:t>
+            </w:r>
+          </w:p>
+        </w:tc>
+      </w:tr>
+      <w:tr>
+        <w:tc>
+          <w:tcPr>
+            <w:tcW w:type="dxa" w:w="2608"/>
+          </w:tcPr>
+          <w:p>
+            <w:pPr>
+              <w:spacing w:before="40" w:after="40" w:line="312" w:lineRule="auto"/>
+            </w:pPr>
+            <w:r/>
+            <w:r>
+              <w:rPr>
+                <w:sz w:val="19"/>
+                <w:rFonts w:ascii="맑은 고딕" w:hAnsi="맑은 고딕" w:eastAsia="맑은 고딕"/>
+              </w:rPr>
+              <w:t>① 줄 바꿈은 &lt;br&gt;</w:t>
+            </w:r>
+          </w:p>
+        </w:tc>
+        <w:tc>
+          <w:tcPr>
+            <w:tcW w:type="dxa" w:w="7030"/>
+          </w:tcPr>
+          <w:p>
+            <w:pPr>
+              <w:spacing w:before="40" w:after="40" w:line="312" w:lineRule="auto"/>
+            </w:pPr>
+            <w:r/>
+            <w:r>
+              <w:rPr>
+                <w:sz w:val="19"/>
+                <w:rFonts w:ascii="맑은 고딕" w:hAnsi="맑은 고딕" w:eastAsia="맑은 고딕"/>
+              </w:rPr>
+              <w:t>코드에서 엔터를 쳐도 메일에서는 줄이 바뀌지 않는다. 줄을 바꾸려면 줄 끝에 &lt;br&gt; 을 쓴다</w:t>
+            </w:r>
+          </w:p>
+        </w:tc>
+      </w:tr>
+      <w:tr>
+        <w:tc>
+          <w:tcPr>
+            <w:tcW w:type="dxa" w:w="2608"/>
+            <w:shd w:val="clear" w:color="auto" w:fill="F2F5F8"/>
+          </w:tcPr>
+          <w:p>
+            <w:pPr>
+              <w:spacing w:before="40" w:after="40" w:line="312" w:lineRule="auto"/>
+            </w:pPr>
+            <w:r/>
+            <w:r>
+              <w:rPr>
+                <w:sz w:val="19"/>
+                <w:rFonts w:ascii="맑은 고딕" w:hAnsi="맑은 고딕" w:eastAsia="맑은 고딕"/>
+              </w:rPr>
+              <w:t>② 열었으면 닫는다</w:t>
+            </w:r>
+          </w:p>
+        </w:tc>
+        <w:tc>
+          <w:tcPr>
+            <w:tcW w:type="dxa" w:w="7030"/>
+            <w:shd w:val="clear" w:color="auto" w:fill="F2F5F8"/>
+          </w:tcPr>
+          <w:p>
+            <w:pPr>
+              <w:spacing w:before="40" w:after="40" w:line="312" w:lineRule="auto"/>
+            </w:pPr>
+            <w:r/>
+            <w:r>
+              <w:rPr>
+                <w:sz w:val="19"/>
+                <w:rFonts w:ascii="맑은 고딕" w:hAnsi="맑은 고딕" w:eastAsia="맑은 고딕"/>
+              </w:rPr>
+              <w:t>&lt;strong&gt; 을 열었으면 &lt;/strong&gt; 으로 닫는다. 안 닫으면 그 뒤의 글이 전부 굵어진다. (단 &lt;br&gt; 은 닫지 않는다)</w:t>
+            </w:r>
+          </w:p>
+        </w:tc>
+      </w:tr>
+      <w:tr>
+        <w:tc>
+          <w:tcPr>
+            <w:tcW w:type="dxa" w:w="2608"/>
+          </w:tcPr>
+          <w:p>
+            <w:pPr>
+              <w:spacing w:before="40" w:after="40" w:line="312" w:lineRule="auto"/>
+            </w:pPr>
+            <w:r/>
+            <w:r>
+              <w:rPr>
+                <w:sz w:val="19"/>
+                <w:rFonts w:ascii="맑은 고딕" w:hAnsi="맑은 고딕" w:eastAsia="맑은 고딕"/>
+              </w:rPr>
+              <w:t>③ 엔터·공백은 무시된다</w:t>
+            </w:r>
+          </w:p>
+        </w:tc>
+        <w:tc>
+          <w:tcPr>
+            <w:tcW w:type="dxa" w:w="7030"/>
+          </w:tcPr>
+          <w:p>
+            <w:pPr>
+              <w:spacing w:before="40" w:after="40" w:line="312" w:lineRule="auto"/>
+            </w:pPr>
+            <w:r/>
+            <w:r>
+              <w:rPr>
+                <w:sz w:val="19"/>
+                <w:rFonts w:ascii="맑은 고딕" w:hAnsi="맑은 고딕" w:eastAsia="맑은 고딕"/>
+              </w:rPr>
+              <w:t>코드에서 띄어쓰기를 여러 칸 넣어도 메일에서는 한 칸이다. 코드를 보기 좋게 정리하는 용도로만 쓴다</w:t>
+            </w:r>
+          </w:p>
+        </w:tc>
+      </w:tr>
+    </w:tbl>
+    <w:p>
+      <w:pPr>
+        <w:spacing w:before="0" w:after="120" w:line="240" w:lineRule="auto"/>
+      </w:pPr>
+      <w:r>
+        <w:rPr>
+          <w:sz w:val="2"/>
+          <w:rFonts w:ascii="맑은 고딕" w:hAnsi="맑은 고딕" w:eastAsia="맑은 고딕"/>
+        </w:rPr>
+      </w:r>
+    </w:p>
+    <w:p>
+      <w:pPr>
+        <w:spacing w:before="160" w:after="40"/>
+        <w:jc w:val="center"/>
+      </w:pPr>
+      <w:r>
+        <w:drawing>
+          <wp:inline xmlns:a="http://schemas.openxmlformats.org/drawingml/2006/main" xmlns:pic="http://schemas.openxmlformats.org/drawingml/2006/picture">
+            <wp:extent cx="5940000" cy="4333154"/>
+            <wp:docPr id="2" name="Picture 2"/>
+            <wp:cNvGraphicFramePr>
+              <a:graphicFrameLocks noChangeAspect="1"/>
+            </wp:cNvGraphicFramePr>
+            <a:graphic>
+              <a:graphicData uri="http://schemas.openxmlformats.org/drawingml/2006/picture">
+                <pic:pic>
+                  <pic:nvPicPr>
+                    <pic:cNvPr id="0" name="cmp_1_linebreak.png"/>
+                    <pic:cNvPicPr/>
+                  </pic:nvPicPr>
+                  <pic:blipFill>
+                    <a:blip r:embed="rId10"/>
+                    <a:stretch>
+                      <a:fillRect/>
+                    </a:stretch>
+                  </pic:blipFill>
+                  <pic:spPr>
+                    <a:xfrm>
+                      <a:off x="0" y="0"/>
+                      <a:ext cx="5940000" cy="4333154"/>
+                    </a:xfrm>
+                    <a:prstGeom prst="rect"/>
+                  </pic:spPr>
+                </pic:pic>
+              </a:graphicData>
+            </a:graphic>
+          </wp:inline>
+        </w:drawing>
+      </w:r>
+    </w:p>
+    <w:p>
+      <w:pPr>
+        <w:spacing w:before="0" w:after="240"/>
+        <w:jc w:val="center"/>
+      </w:pPr>
+      <w:r>
+        <w:rPr>
+          <w:color w:val="6B7280"/>
+          <w:sz w:val="18"/>
+          <w:rFonts w:ascii="맑은 고딕" w:hAnsi="맑은 고딕" w:eastAsia="맑은 고딕"/>
+        </w:rPr>
+        <w:t>그림 2. 엔터만 치면 한 줄로 이어 붙고, &lt;br&gt; 을 쓰면 줄이 바뀐다</w:t>
+      </w:r>
+    </w:p>
+    <w:p>
+      <w:pPr>
+        <w:spacing w:before="160" w:after="160" w:line="336" w:lineRule="auto"/>
+        <w:ind w:left="142" w:right="57"/>
+        <w:shd w:val="clear" w:color="auto" w:fill="FDF1E7"/>
+        <w:pBdr>
+          <w:left w:val="single" w:sz="20" w:space="6" w:color="B32020"/>
+        </w:pBdr>
+      </w:pPr>
+      <w:r>
+        <w:rPr>
+          <w:b/>
+          <w:color w:val="B32020"/>
+          <w:sz w:val="21"/>
+          <w:rFonts w:ascii="맑은 고딕" w:hAnsi="맑은 고딕" w:eastAsia="맑은 고딕"/>
+        </w:rPr>
+        <w:t xml:space="preserve">※ </w:t>
+      </w:r>
+      <w:r>
+        <w:rPr>
+          <w:b/>
+          <w:color w:val="B32020"/>
+          <w:sz w:val="21"/>
+          <w:rFonts w:ascii="맑은 고딕" w:hAnsi="맑은 고딕" w:eastAsia="맑은 고딕"/>
+        </w:rPr>
+        <w:t xml:space="preserve">엔터 ≠ 줄 바꿈  </w:t>
+      </w:r>
+      <w:r>
+        <w:rPr>
+          <w:sz w:val="20"/>
+          <w:rFonts w:ascii="맑은 고딕" w:hAnsi="맑은 고딕" w:eastAsia="맑은 고딕"/>
+        </w:rPr>
+        <w:t>가장 많이 하는 실수입니다. 메모장에서 쓴 글을 그대로 붙여넣으면 메일에서는 한 덩어리로 붙어 나옵니다. 붙여넣은 뒤 줄마다 끝에 &lt;br&gt; 을 붙이는 것을 잊지 마세요.</w:t>
+      </w:r>
+    </w:p>
+    <w:p>
+      <w:pPr>
+        <w:pStyle w:val="Heading2"/>
+        <w:spacing w:before="280" w:after="100" w:line="312" w:lineRule="auto"/>
+        <w:pBdr>
+          <w:bottom w:val="single" w:sz="4" w:space="3" w:color="C9D2DC"/>
+        </w:pBdr>
+      </w:pPr>
+      <w:r>
+        <w:rPr>
+          <w:b/>
+          <w:color w:val="0F5C8C"/>
+          <w:sz w:val="24"/>
+          <w:rFonts w:ascii="맑은 고딕" w:hAnsi="맑은 고딕" w:eastAsia="맑은 고딕"/>
+        </w:rPr>
+        <w:t>■ 7-2. 자주 쓰는 꾸미기 — 복사해서 쓰는 사전</w:t>
+      </w:r>
+    </w:p>
+    <w:tbl>
+      <w:tblPr>
+        <w:tblStyle w:val="TableGrid"/>
+        <w:tblW w:type="auto" w:w="0"/>
+        <w:jc w:val="left"/>
+        <w:tblLayout w:type="fixed"/>
+        <w:tblLook w:firstColumn="1" w:firstRow="1" w:lastColumn="0" w:lastRow="0" w:noHBand="0" w:noVBand="1" w:val="04A0"/>
+        <w:tblLayout w:type="fixed"/>
+      </w:tblPr>
+      <w:tblGrid>
+        <w:gridCol w:w="4986"/>
+        <w:gridCol w:w="4986"/>
+      </w:tblGrid>
+      <w:tr>
+        <w:tc>
+          <w:tcPr>
+            <w:tcW w:type="dxa" w:w="2948"/>
+            <w:shd w:val="clear" w:color="auto" w:fill="1E3A5F"/>
+          </w:tcPr>
+          <w:p>
+            <w:pPr>
+              <w:spacing w:before="60" w:after="60" w:line="300" w:lineRule="auto"/>
+            </w:pPr>
+            <w:r/>
+            <w:r>
+              <w:rPr>
+                <w:b/>
+                <w:color w:val="FFFFFF"/>
+                <w:sz w:val="20"/>
+                <w:rFonts w:ascii="맑은 고딕" w:hAnsi="맑은 고딕" w:eastAsia="맑은 고딕"/>
+              </w:rPr>
+              <w:t>하고 싶은 것</w:t>
+            </w:r>
+          </w:p>
+        </w:tc>
+        <w:tc>
+          <w:tcPr>
+            <w:tcW w:type="dxa" w:w="6690"/>
+            <w:shd w:val="clear" w:color="auto" w:fill="1E3A5F"/>
+          </w:tcPr>
+          <w:p>
+            <w:pPr>
+              <w:spacing w:before="60" w:after="60" w:line="300" w:lineRule="auto"/>
+            </w:pPr>
+            <w:r/>
+            <w:r>
+              <w:rPr>
+                <w:b/>
+                <w:color w:val="FFFFFF"/>
+                <w:sz w:val="20"/>
+                <w:rFonts w:ascii="맑은 고딕" w:hAnsi="맑은 고딕" w:eastAsia="맑은 고딕"/>
+              </w:rPr>
+              <w:t>이렇게 쓴다</w:t>
+            </w:r>
+          </w:p>
+        </w:tc>
+      </w:tr>
+      <w:tr>
+        <w:tc>
+          <w:tcPr>
+            <w:tcW w:type="dxa" w:w="2948"/>
+          </w:tcPr>
+          <w:p>
+            <w:pPr>
+              <w:spacing w:before="40" w:after="40" w:line="312" w:lineRule="auto"/>
+            </w:pPr>
+            <w:r/>
+            <w:r>
+              <w:rPr>
+                <w:sz w:val="19"/>
+                <w:rFonts w:ascii="맑은 고딕" w:hAnsi="맑은 고딕" w:eastAsia="맑은 고딕"/>
+              </w:rPr>
+              <w:t>줄 바꿈</w:t>
+            </w:r>
+          </w:p>
+        </w:tc>
+        <w:tc>
+          <w:tcPr>
+            <w:tcW w:type="dxa" w:w="6690"/>
+          </w:tcPr>
+          <w:p>
+            <w:pPr>
+              <w:spacing w:before="40" w:after="40" w:line="312" w:lineRule="auto"/>
+            </w:pPr>
+            <w:r/>
+            <w:r>
+              <w:rPr>
+                <w:sz w:val="19"/>
+                <w:rFonts w:ascii="Consolas" w:hAnsi="Consolas" w:eastAsia="Consolas"/>
+              </w:rPr>
+              <w:t>글&lt;br&gt;</w:t>
+            </w:r>
+          </w:p>
+        </w:tc>
+      </w:tr>
+      <w:tr>
+        <w:tc>
+          <w:tcPr>
+            <w:tcW w:type="dxa" w:w="2948"/>
+            <w:shd w:val="clear" w:color="auto" w:fill="F2F5F8"/>
+          </w:tcPr>
+          <w:p>
+            <w:pPr>
+              <w:spacing w:before="40" w:after="40" w:line="312" w:lineRule="auto"/>
+            </w:pPr>
+            <w:r/>
+            <w:r>
+              <w:rPr>
+                <w:sz w:val="19"/>
+                <w:rFonts w:ascii="맑은 고딕" w:hAnsi="맑은 고딕" w:eastAsia="맑은 고딕"/>
+              </w:rPr>
+              <w:t>한 줄 비우기 (문단 나누기)</w:t>
+            </w:r>
+          </w:p>
+        </w:tc>
+        <w:tc>
+          <w:tcPr>
+            <w:tcW w:type="dxa" w:w="6690"/>
+            <w:shd w:val="clear" w:color="auto" w:fill="F2F5F8"/>
+          </w:tcPr>
+          <w:p>
+            <w:pPr>
+              <w:spacing w:before="40" w:after="40" w:line="312" w:lineRule="auto"/>
+            </w:pPr>
+            <w:r/>
+            <w:r>
+              <w:rPr>
+                <w:sz w:val="19"/>
+                <w:rFonts w:ascii="Consolas" w:hAnsi="Consolas" w:eastAsia="Consolas"/>
+              </w:rPr>
+              <w:t>글&lt;br&gt;&lt;br&gt;</w:t>
+            </w:r>
+          </w:p>
+        </w:tc>
+      </w:tr>
+      <w:tr>
+        <w:tc>
+          <w:tcPr>
+            <w:tcW w:type="dxa" w:w="2948"/>
+          </w:tcPr>
+          <w:p>
+            <w:pPr>
+              <w:spacing w:before="40" w:after="40" w:line="312" w:lineRule="auto"/>
+            </w:pPr>
+            <w:r/>
+            <w:r>
+              <w:rPr>
+                <w:sz w:val="19"/>
+                <w:rFonts w:ascii="맑은 고딕" w:hAnsi="맑은 고딕" w:eastAsia="맑은 고딕"/>
+              </w:rPr>
+              <w:t>굵게</w:t>
+            </w:r>
+          </w:p>
+        </w:tc>
+        <w:tc>
+          <w:tcPr>
+            <w:tcW w:type="dxa" w:w="6690"/>
+          </w:tcPr>
+          <w:p>
+            <w:pPr>
+              <w:spacing w:before="40" w:after="40" w:line="312" w:lineRule="auto"/>
+            </w:pPr>
+            <w:r/>
+            <w:r>
+              <w:rPr>
+                <w:sz w:val="19"/>
+                <w:rFonts w:ascii="Consolas" w:hAnsi="Consolas" w:eastAsia="Consolas"/>
+              </w:rPr>
+              <w:t>&lt;strong&gt;굵은 글&lt;/strong&gt;</w:t>
+            </w:r>
+          </w:p>
+        </w:tc>
+      </w:tr>
+      <w:tr>
+        <w:tc>
+          <w:tcPr>
+            <w:tcW w:type="dxa" w:w="2948"/>
+            <w:shd w:val="clear" w:color="auto" w:fill="F2F5F8"/>
+          </w:tcPr>
+          <w:p>
+            <w:pPr>
+              <w:spacing w:before="40" w:after="40" w:line="312" w:lineRule="auto"/>
+            </w:pPr>
+            <w:r/>
+            <w:r>
+              <w:rPr>
+                <w:sz w:val="19"/>
+                <w:rFonts w:ascii="맑은 고딕" w:hAnsi="맑은 고딕" w:eastAsia="맑은 고딕"/>
+              </w:rPr>
+              <w:t>밑줄 / 기울임</w:t>
+            </w:r>
+          </w:p>
+        </w:tc>
+        <w:tc>
+          <w:tcPr>
+            <w:tcW w:type="dxa" w:w="6690"/>
+            <w:shd w:val="clear" w:color="auto" w:fill="F2F5F8"/>
+          </w:tcPr>
+          <w:p>
+            <w:pPr>
+              <w:spacing w:before="40" w:after="40" w:line="312" w:lineRule="auto"/>
+            </w:pPr>
+            <w:r/>
+            <w:r>
+              <w:rPr>
+                <w:sz w:val="19"/>
+                <w:rFonts w:ascii="Consolas" w:hAnsi="Consolas" w:eastAsia="Consolas"/>
+              </w:rPr>
+              <w:t>&lt;u&gt;밑줄&lt;/u&gt;   &lt;i&gt;기울임&lt;/i&gt;</w:t>
+            </w:r>
+          </w:p>
+        </w:tc>
+      </w:tr>
+      <w:tr>
+        <w:tc>
+          <w:tcPr>
+            <w:tcW w:type="dxa" w:w="2948"/>
+          </w:tcPr>
+          <w:p>
+            <w:pPr>
+              <w:spacing w:before="40" w:after="40" w:line="312" w:lineRule="auto"/>
+            </w:pPr>
+            <w:r/>
+            <w:r>
+              <w:rPr>
+                <w:sz w:val="19"/>
+                <w:rFonts w:ascii="맑은 고딕" w:hAnsi="맑은 고딕" w:eastAsia="맑은 고딕"/>
+              </w:rPr>
+              <w:t>빨간 글씨</w:t>
+            </w:r>
+          </w:p>
+        </w:tc>
+        <w:tc>
+          <w:tcPr>
+            <w:tcW w:type="dxa" w:w="6690"/>
+          </w:tcPr>
+          <w:p>
+            <w:pPr>
+              <w:spacing w:before="40" w:after="40" w:line="312" w:lineRule="auto"/>
+            </w:pPr>
+            <w:r/>
+            <w:r>
+              <w:rPr>
+                <w:sz w:val="19"/>
+                <w:rFonts w:ascii="Consolas" w:hAnsi="Consolas" w:eastAsia="Consolas"/>
+              </w:rPr>
+              <w:t>&lt;span style="color: #c00;"&gt;빨간 글&lt;/span&gt;</w:t>
+            </w:r>
+          </w:p>
+        </w:tc>
+      </w:tr>
+      <w:tr>
+        <w:tc>
+          <w:tcPr>
+            <w:tcW w:type="dxa" w:w="2948"/>
+            <w:shd w:val="clear" w:color="auto" w:fill="F2F5F8"/>
+          </w:tcPr>
+          <w:p>
+            <w:pPr>
+              <w:spacing w:before="40" w:after="40" w:line="312" w:lineRule="auto"/>
+            </w:pPr>
+            <w:r/>
+            <w:r>
+              <w:rPr>
+                <w:sz w:val="19"/>
+                <w:rFonts w:ascii="맑은 고딕" w:hAnsi="맑은 고딕" w:eastAsia="맑은 고딕"/>
+              </w:rPr>
+              <w:t>형광펜 (배경색)</w:t>
+            </w:r>
+          </w:p>
+        </w:tc>
+        <w:tc>
+          <w:tcPr>
+            <w:tcW w:type="dxa" w:w="6690"/>
+            <w:shd w:val="clear" w:color="auto" w:fill="F2F5F8"/>
+          </w:tcPr>
+          <w:p>
+            <w:pPr>
+              <w:spacing w:before="40" w:after="40" w:line="312" w:lineRule="auto"/>
+            </w:pPr>
+            <w:r/>
+            <w:r>
+              <w:rPr>
+                <w:sz w:val="19"/>
+                <w:rFonts w:ascii="Consolas" w:hAnsi="Consolas" w:eastAsia="Consolas"/>
+              </w:rPr>
+              <w:t>&lt;span style="background: #ffeb3b;"&gt;강조할 글&lt;/span&gt;</w:t>
+            </w:r>
+          </w:p>
+        </w:tc>
+      </w:tr>
+      <w:tr>
+        <w:tc>
+          <w:tcPr>
+            <w:tcW w:type="dxa" w:w="2948"/>
+          </w:tcPr>
+          <w:p>
+            <w:pPr>
+              <w:spacing w:before="40" w:after="40" w:line="312" w:lineRule="auto"/>
+            </w:pPr>
+            <w:r/>
+            <w:r>
+              <w:rPr>
+                <w:sz w:val="19"/>
+                <w:rFonts w:ascii="맑은 고딕" w:hAnsi="맑은 고딕" w:eastAsia="맑은 고딕"/>
+              </w:rPr>
+              <w:t>글자 크기 키우기</w:t>
+            </w:r>
+          </w:p>
+        </w:tc>
+        <w:tc>
+          <w:tcPr>
+            <w:tcW w:type="dxa" w:w="6690"/>
+          </w:tcPr>
+          <w:p>
+            <w:pPr>
+              <w:spacing w:before="40" w:after="40" w:line="312" w:lineRule="auto"/>
+            </w:pPr>
+            <w:r/>
+            <w:r>
+              <w:rPr>
+                <w:sz w:val="19"/>
+                <w:rFonts w:ascii="Consolas" w:hAnsi="Consolas" w:eastAsia="Consolas"/>
+              </w:rPr>
+              <w:t>&lt;span style="font-size: 18px;"&gt;큰 글&lt;/span&gt;</w:t>
+            </w:r>
+          </w:p>
+        </w:tc>
+      </w:tr>
+      <w:tr>
+        <w:tc>
+          <w:tcPr>
+            <w:tcW w:type="dxa" w:w="2948"/>
+            <w:shd w:val="clear" w:color="auto" w:fill="F2F5F8"/>
+          </w:tcPr>
+          <w:p>
+            <w:pPr>
+              <w:spacing w:before="40" w:after="40" w:line="312" w:lineRule="auto"/>
+            </w:pPr>
+            <w:r/>
+            <w:r>
+              <w:rPr>
+                <w:sz w:val="19"/>
+                <w:rFonts w:ascii="맑은 고딕" w:hAnsi="맑은 고딕" w:eastAsia="맑은 고딕"/>
+              </w:rPr>
+              <w:t>한 단계 들여쓰기</w:t>
+            </w:r>
+          </w:p>
+        </w:tc>
+        <w:tc>
+          <w:tcPr>
+            <w:tcW w:type="dxa" w:w="6690"/>
+            <w:shd w:val="clear" w:color="auto" w:fill="F2F5F8"/>
+          </w:tcPr>
+          <w:p>
+            <w:pPr>
+              <w:spacing w:before="40" w:after="40" w:line="312" w:lineRule="auto"/>
+            </w:pPr>
+            <w:r/>
+            <w:r>
+              <w:rPr>
+                <w:sz w:val="19"/>
+                <w:rFonts w:ascii="Consolas" w:hAnsi="Consolas" w:eastAsia="Consolas"/>
+              </w:rPr>
+              <w:t>&lt;div style="margin-left: 20px;"&gt; … &lt;/div&gt;</w:t>
+            </w:r>
+          </w:p>
+        </w:tc>
+      </w:tr>
+      <w:tr>
+        <w:tc>
+          <w:tcPr>
+            <w:tcW w:type="dxa" w:w="2948"/>
+          </w:tcPr>
+          <w:p>
+            <w:pPr>
+              <w:spacing w:before="40" w:after="40" w:line="312" w:lineRule="auto"/>
+            </w:pPr>
+            <w:r/>
+            <w:r>
+              <w:rPr>
+                <w:sz w:val="19"/>
+                <w:rFonts w:ascii="맑은 고딕" w:hAnsi="맑은 고딕" w:eastAsia="맑은 고딕"/>
+              </w:rPr>
+              <w:t>두 단계 들여쓰기</w:t>
+            </w:r>
+          </w:p>
+        </w:tc>
+        <w:tc>
+          <w:tcPr>
+            <w:tcW w:type="dxa" w:w="6690"/>
+          </w:tcPr>
+          <w:p>
+            <w:pPr>
+              <w:spacing w:before="40" w:after="40" w:line="312" w:lineRule="auto"/>
+            </w:pPr>
+            <w:r/>
+            <w:r>
+              <w:rPr>
+                <w:sz w:val="19"/>
+                <w:rFonts w:ascii="Consolas" w:hAnsi="Consolas" w:eastAsia="Consolas"/>
+              </w:rPr>
+              <w:t>&lt;div style="margin-left: 20px;"&gt;&lt;div style="margin-left: 20px;"&gt; … &lt;/div&gt;&lt;/div&gt;</w:t>
+            </w:r>
+          </w:p>
+        </w:tc>
+      </w:tr>
+      <w:tr>
+        <w:tc>
+          <w:tcPr>
+            <w:tcW w:type="dxa" w:w="2948"/>
+            <w:shd w:val="clear" w:color="auto" w:fill="F2F5F8"/>
+          </w:tcPr>
+          <w:p>
+            <w:pPr>
+              <w:spacing w:before="40" w:after="40" w:line="312" w:lineRule="auto"/>
+            </w:pPr>
+            <w:r/>
+            <w:r>
+              <w:rPr>
+                <w:sz w:val="19"/>
+                <w:rFonts w:ascii="맑은 고딕" w:hAnsi="맑은 고딕" w:eastAsia="맑은 고딕"/>
+              </w:rPr>
+              <w:t>가로 구분선</w:t>
+            </w:r>
+          </w:p>
+        </w:tc>
+        <w:tc>
+          <w:tcPr>
+            <w:tcW w:type="dxa" w:w="6690"/>
+            <w:shd w:val="clear" w:color="auto" w:fill="F2F5F8"/>
+          </w:tcPr>
+          <w:p>
+            <w:pPr>
+              <w:spacing w:before="40" w:after="40" w:line="312" w:lineRule="auto"/>
+            </w:pPr>
+            <w:r/>
+            <w:r>
+              <w:rPr>
+                <w:sz w:val="19"/>
+                <w:rFonts w:ascii="Consolas" w:hAnsi="Consolas" w:eastAsia="Consolas"/>
+              </w:rPr>
+              <w:t>&lt;hr&gt;</w:t>
+            </w:r>
+          </w:p>
+        </w:tc>
+      </w:tr>
+    </w:tbl>
+    <w:p>
+      <w:pPr>
+        <w:spacing w:before="0" w:after="120" w:line="240" w:lineRule="auto"/>
+      </w:pPr>
+      <w:r>
+        <w:rPr>
+          <w:sz w:val="2"/>
+          <w:rFonts w:ascii="맑은 고딕" w:hAnsi="맑은 고딕" w:eastAsia="맑은 고딕"/>
+        </w:rPr>
+      </w:r>
+    </w:p>
+    <w:p>
+      <w:pPr>
+        <w:spacing w:before="160" w:after="40"/>
+        <w:jc w:val="center"/>
+      </w:pPr>
+      <w:r>
+        <w:drawing>
+          <wp:inline xmlns:a="http://schemas.openxmlformats.org/drawingml/2006/main" xmlns:pic="http://schemas.openxmlformats.org/drawingml/2006/picture">
+            <wp:extent cx="5940000" cy="3697269"/>
+            <wp:docPr id="3" name="Picture 3"/>
+            <wp:cNvGraphicFramePr>
+              <a:graphicFrameLocks noChangeAspect="1"/>
+            </wp:cNvGraphicFramePr>
+            <a:graphic>
+              <a:graphicData uri="http://schemas.openxmlformats.org/drawingml/2006/picture">
+                <pic:pic>
+                  <pic:nvPicPr>
+                    <pic:cNvPr id="0" name="cmp_2_text.png"/>
+                    <pic:cNvPicPr/>
+                  </pic:nvPicPr>
+                  <pic:blipFill>
+                    <a:blip r:embed="rId11"/>
+                    <a:stretch>
+                      <a:fillRect/>
+                    </a:stretch>
+                  </pic:blipFill>
+                  <pic:spPr>
+                    <a:xfrm>
+                      <a:off x="0" y="0"/>
+                      <a:ext cx="5940000" cy="3697269"/>
+                    </a:xfrm>
+                    <a:prstGeom prst="rect"/>
+                  </pic:spPr>
+                </pic:pic>
+              </a:graphicData>
+            </a:graphic>
+          </wp:inline>
+        </w:drawing>
+      </w:r>
+    </w:p>
+    <w:p>
+      <w:pPr>
+        <w:spacing w:before="0" w:after="240"/>
+        <w:jc w:val="center"/>
+      </w:pPr>
+      <w:r>
+        <w:rPr>
+          <w:color w:val="6B7280"/>
+          <w:sz w:val="18"/>
+          <w:rFonts w:ascii="맑은 고딕" w:hAnsi="맑은 고딕" w:eastAsia="맑은 고딕"/>
+        </w:rPr>
+        <w:t>그림 3. 굵게 · 색 · 배경 강조와 들여쓰기</w:t>
+      </w:r>
+    </w:p>
+    <w:p>
+      <w:r>
+        <w:rPr>
+          <w:sz w:val="21"/>
+          <w:rFonts w:ascii="맑은 고딕" w:hAnsi="맑은 고딕" w:eastAsia="맑은 고딕"/>
+        </w:rPr>
+        <w:t xml:space="preserve">들여쓰기는 </w:t>
+      </w:r>
+      <w:r>
+        <w:rPr>
+          <w:b/>
+          <w:sz w:val="21"/>
+          <w:rFonts w:ascii="맑은 고딕" w:hAnsi="맑은 고딕" w:eastAsia="맑은 고딕"/>
+        </w:rPr>
+        <w:t>&lt;div&gt; 를 겹치는 만큼 단계가 쌓입니다</w:t>
+      </w:r>
+      <w:r>
+        <w:rPr>
+          <w:sz w:val="21"/>
+          <w:rFonts w:ascii="맑은 고딕" w:hAnsi="맑은 고딕" w:eastAsia="맑은 고딕"/>
+        </w:rPr>
+        <w:t>. 기존 메일 본문의 “1. → 가. → -” 같은 계층을 그대로 만들 수 있습니다.</w:t>
+      </w:r>
+    </w:p>
+    <w:p>
+      <w:pPr>
+        <w:pStyle w:val="Heading3"/>
+        <w:spacing w:before="200" w:after="60"/>
+      </w:pPr>
+      <w:r>
+        <w:rPr>
+          <w:b/>
+          <w:color w:val="1A1A1A"/>
+          <w:sz w:val="21"/>
+          <w:rFonts w:ascii="맑은 고딕" w:hAnsi="맑은 고딕" w:eastAsia="맑은 고딕"/>
+        </w:rPr>
+        <w:t>표 만들기</w:t>
+      </w:r>
+    </w:p>
+    <w:p>
+      <w:r>
+        <w:rPr>
+          <w:sz w:val="21"/>
+          <w:rFonts w:ascii="맑은 고딕" w:hAnsi="맑은 고딕" w:eastAsia="맑은 고딕"/>
+        </w:rPr>
+        <w:t xml:space="preserve">항목이 여러 개이고 칸을 맞춰야 할 때는 표를 씁니다. 메일 프로그램마다 스타일 해석이 조금씩 달라서, 표는 </w:t>
+      </w:r>
+      <w:r>
+        <w:rPr>
+          <w:b/>
+          <w:sz w:val="21"/>
+          <w:rFonts w:ascii="맑은 고딕" w:hAnsi="맑은 고딕" w:eastAsia="맑은 고딕"/>
+        </w:rPr>
+        <w:t>border · cellpadding 속성을 직접 쓰는 방식</w:t>
+      </w:r>
+      <w:r>
+        <w:rPr>
+          <w:sz w:val="21"/>
+          <w:rFonts w:ascii="맑은 고딕" w:hAnsi="맑은 고딕" w:eastAsia="맑은 고딕"/>
+        </w:rPr>
+        <w:t xml:space="preserve"> 이 가장 안전합니다.</w:t>
+      </w:r>
+    </w:p>
+    <w:p>
+      <w:pPr>
+        <w:spacing w:before="160" w:after="40"/>
+        <w:jc w:val="center"/>
+      </w:pPr>
+      <w:r>
+        <w:drawing>
+          <wp:inline xmlns:a="http://schemas.openxmlformats.org/drawingml/2006/main" xmlns:pic="http://schemas.openxmlformats.org/drawingml/2006/picture">
+            <wp:extent cx="5940000" cy="2596846"/>
+            <wp:docPr id="4" name="Picture 4"/>
+            <wp:cNvGraphicFramePr>
+              <a:graphicFrameLocks noChangeAspect="1"/>
+            </wp:cNvGraphicFramePr>
+            <a:graphic>
+              <a:graphicData uri="http://schemas.openxmlformats.org/drawingml/2006/picture">
+                <pic:pic>
+                  <pic:nvPicPr>
+                    <pic:cNvPr id="0" name="cmp_3_table.png"/>
+                    <pic:cNvPicPr/>
+                  </pic:nvPicPr>
+                  <pic:blipFill>
+                    <a:blip r:embed="rId12"/>
+                    <a:stretch>
+                      <a:fillRect/>
+                    </a:stretch>
+                  </pic:blipFill>
+                  <pic:spPr>
+                    <a:xfrm>
+                      <a:off x="0" y="0"/>
+                      <a:ext cx="5940000" cy="2596846"/>
+                    </a:xfrm>
+                    <a:prstGeom prst="rect"/>
+                  </pic:spPr>
+                </pic:pic>
+              </a:graphicData>
+            </a:graphic>
+          </wp:inline>
+        </w:drawing>
+      </w:r>
+    </w:p>
+    <w:p>
+      <w:pPr>
+        <w:spacing w:before="0" w:after="240"/>
+        <w:jc w:val="center"/>
+      </w:pPr>
+      <w:r>
+        <w:rPr>
+          <w:color w:val="6B7280"/>
+          <w:sz w:val="18"/>
+          <w:rFonts w:ascii="맑은 고딕" w:hAnsi="맑은 고딕" w:eastAsia="맑은 고딕"/>
+        </w:rPr>
+        <w:t>그림 4. 표: &lt;tr&gt; 한 줄, &lt;th&gt; 머리 칸, &lt;td&gt; 일반 칸</w:t>
+      </w:r>
+    </w:p>
+    <w:tbl>
+      <w:tblPr>
+        <w:tblStyle w:val="TableGrid"/>
+        <w:tblW w:type="auto" w:w="0"/>
+        <w:jc w:val="left"/>
+        <w:tblLayout w:type="fixed"/>
+        <w:tblLook w:firstColumn="1" w:firstRow="1" w:lastColumn="0" w:lastRow="0" w:noHBand="0" w:noVBand="1" w:val="04A0"/>
+        <w:tblLayout w:type="fixed"/>
+      </w:tblPr>
+      <w:tblGrid>
+        <w:gridCol w:w="4986"/>
+        <w:gridCol w:w="4986"/>
+      </w:tblGrid>
+      <w:tr>
+        <w:tc>
+          <w:tcPr>
+            <w:tcW w:type="dxa" w:w="2948"/>
+            <w:shd w:val="clear" w:color="auto" w:fill="1E3A5F"/>
+          </w:tcPr>
+          <w:p>
+            <w:pPr>
+              <w:spacing w:before="60" w:after="60" w:line="300" w:lineRule="auto"/>
+            </w:pPr>
+            <w:r/>
+            <w:r>
+              <w:rPr>
+                <w:b/>
+                <w:color w:val="FFFFFF"/>
+                <w:sz w:val="20"/>
+                <w:rFonts w:ascii="맑은 고딕" w:hAnsi="맑은 고딕" w:eastAsia="맑은 고딕"/>
+              </w:rPr>
+              <w:t>태그</w:t>
+            </w:r>
+          </w:p>
+        </w:tc>
+        <w:tc>
+          <w:tcPr>
+            <w:tcW w:type="dxa" w:w="6690"/>
+            <w:shd w:val="clear" w:color="auto" w:fill="1E3A5F"/>
+          </w:tcPr>
+          <w:p>
+            <w:pPr>
+              <w:spacing w:before="60" w:after="60" w:line="300" w:lineRule="auto"/>
+            </w:pPr>
+            <w:r/>
+            <w:r>
+              <w:rPr>
+                <w:b/>
+                <w:color w:val="FFFFFF"/>
+                <w:sz w:val="20"/>
+                <w:rFonts w:ascii="맑은 고딕" w:hAnsi="맑은 고딕" w:eastAsia="맑은 고딕"/>
+              </w:rPr>
+              <w:t>뜻</w:t>
+            </w:r>
+          </w:p>
+        </w:tc>
+      </w:tr>
+      <w:tr>
+        <w:tc>
+          <w:tcPr>
+            <w:tcW w:type="dxa" w:w="2948"/>
+          </w:tcPr>
+          <w:p>
+            <w:pPr>
+              <w:spacing w:before="40" w:after="40" w:line="312" w:lineRule="auto"/>
+            </w:pPr>
+            <w:r/>
+            <w:r>
+              <w:rPr>
+                <w:sz w:val="19"/>
+                <w:rFonts w:ascii="Consolas" w:hAnsi="Consolas" w:eastAsia="Consolas"/>
+              </w:rPr>
+              <w:t>&lt;table&gt; … &lt;/table&gt;</w:t>
+            </w:r>
+          </w:p>
+        </w:tc>
+        <w:tc>
+          <w:tcPr>
+            <w:tcW w:type="dxa" w:w="6690"/>
+          </w:tcPr>
+          <w:p>
+            <w:pPr>
+              <w:spacing w:before="40" w:after="40" w:line="312" w:lineRule="auto"/>
+            </w:pPr>
+            <w:r/>
+            <w:r>
+              <w:rPr>
+                <w:sz w:val="19"/>
+                <w:rFonts w:ascii="맑은 고딕" w:hAnsi="맑은 고딕" w:eastAsia="맑은 고딕"/>
+              </w:rPr>
+              <w:t>표 전체</w:t>
+            </w:r>
+          </w:p>
+        </w:tc>
+      </w:tr>
+      <w:tr>
+        <w:tc>
+          <w:tcPr>
+            <w:tcW w:type="dxa" w:w="2948"/>
+            <w:shd w:val="clear" w:color="auto" w:fill="F2F5F8"/>
+          </w:tcPr>
+          <w:p>
+            <w:pPr>
+              <w:spacing w:before="40" w:after="40" w:line="312" w:lineRule="auto"/>
+            </w:pPr>
+            <w:r/>
+            <w:r>
+              <w:rPr>
+                <w:sz w:val="19"/>
+                <w:rFonts w:ascii="Consolas" w:hAnsi="Consolas" w:eastAsia="Consolas"/>
+              </w:rPr>
+              <w:t>&lt;tr&gt; … &lt;/tr&gt;</w:t>
+            </w:r>
+          </w:p>
+        </w:tc>
+        <w:tc>
+          <w:tcPr>
+            <w:tcW w:type="dxa" w:w="6690"/>
+            <w:shd w:val="clear" w:color="auto" w:fill="F2F5F8"/>
+          </w:tcPr>
+          <w:p>
+            <w:pPr>
+              <w:spacing w:before="40" w:after="40" w:line="312" w:lineRule="auto"/>
+            </w:pPr>
+            <w:r/>
+            <w:r>
+              <w:rPr>
+                <w:sz w:val="19"/>
+                <w:rFonts w:ascii="맑은 고딕" w:hAnsi="맑은 고딕" w:eastAsia="맑은 고딕"/>
+              </w:rPr>
+              <w:t>표의 한 줄 (row)</w:t>
+            </w:r>
+          </w:p>
+        </w:tc>
+      </w:tr>
+      <w:tr>
+        <w:tc>
+          <w:tcPr>
+            <w:tcW w:type="dxa" w:w="2948"/>
+          </w:tcPr>
+          <w:p>
+            <w:pPr>
+              <w:spacing w:before="40" w:after="40" w:line="312" w:lineRule="auto"/>
+            </w:pPr>
+            <w:r/>
+            <w:r>
+              <w:rPr>
+                <w:sz w:val="19"/>
+                <w:rFonts w:ascii="Consolas" w:hAnsi="Consolas" w:eastAsia="Consolas"/>
+              </w:rPr>
+              <w:t>&lt;th&gt; … &lt;/th&gt;</w:t>
+            </w:r>
+          </w:p>
+        </w:tc>
+        <w:tc>
+          <w:tcPr>
+            <w:tcW w:type="dxa" w:w="6690"/>
+          </w:tcPr>
+          <w:p>
+            <w:pPr>
+              <w:spacing w:before="40" w:after="40" w:line="312" w:lineRule="auto"/>
+            </w:pPr>
+            <w:r/>
+            <w:r>
+              <w:rPr>
+                <w:sz w:val="19"/>
+                <w:rFonts w:ascii="맑은 고딕" w:hAnsi="맑은 고딕" w:eastAsia="맑은 고딕"/>
+              </w:rPr>
+              <w:t>맨 윗줄의 제목 칸 (굵게, 가운데)</w:t>
+            </w:r>
+          </w:p>
+        </w:tc>
+      </w:tr>
+      <w:tr>
+        <w:tc>
+          <w:tcPr>
+            <w:tcW w:type="dxa" w:w="2948"/>
+            <w:shd w:val="clear" w:color="auto" w:fill="F2F5F8"/>
+          </w:tcPr>
+          <w:p>
+            <w:pPr>
+              <w:spacing w:before="40" w:after="40" w:line="312" w:lineRule="auto"/>
+            </w:pPr>
+            <w:r/>
+            <w:r>
+              <w:rPr>
+                <w:sz w:val="19"/>
+                <w:rFonts w:ascii="Consolas" w:hAnsi="Consolas" w:eastAsia="Consolas"/>
+              </w:rPr>
+              <w:t>&lt;td&gt; … &lt;/td&gt;</w:t>
+            </w:r>
+          </w:p>
+        </w:tc>
+        <w:tc>
+          <w:tcPr>
+            <w:tcW w:type="dxa" w:w="6690"/>
+            <w:shd w:val="clear" w:color="auto" w:fill="F2F5F8"/>
+          </w:tcPr>
+          <w:p>
+            <w:pPr>
+              <w:spacing w:before="40" w:after="40" w:line="312" w:lineRule="auto"/>
+            </w:pPr>
+            <w:r/>
+            <w:r>
+              <w:rPr>
+                <w:sz w:val="19"/>
+                <w:rFonts w:ascii="맑은 고딕" w:hAnsi="맑은 고딕" w:eastAsia="맑은 고딕"/>
+              </w:rPr>
+              <w:t>일반 칸 (cell)</w:t>
+            </w:r>
+          </w:p>
+        </w:tc>
+      </w:tr>
+    </w:tbl>
+    <w:p>
+      <w:pPr>
+        <w:spacing w:before="0" w:after="120" w:line="240" w:lineRule="auto"/>
+      </w:pPr>
+      <w:r>
+        <w:rPr>
+          <w:sz w:val="2"/>
+          <w:rFonts w:ascii="맑은 고딕" w:hAnsi="맑은 고딕" w:eastAsia="맑은 고딕"/>
+        </w:rPr>
+      </w:r>
+    </w:p>
+    <w:p>
+      <w:pPr>
+        <w:pStyle w:val="Heading2"/>
+        <w:spacing w:before="280" w:after="100" w:line="312" w:lineRule="auto"/>
+        <w:pBdr>
+          <w:bottom w:val="single" w:sz="4" w:space="3" w:color="C9D2DC"/>
+        </w:pBdr>
+      </w:pPr>
+      <w:r>
+        <w:rPr>
+          <w:b/>
+          <w:color w:val="0F5C8C"/>
+          <w:sz w:val="24"/>
+          <w:rFonts w:ascii="맑은 고딕" w:hAnsi="맑은 고딕" w:eastAsia="맑은 고딕"/>
+        </w:rPr>
+        <w:t>■ 7-3. 값 끼워 넣기 — &lt;? ?&gt; 3가지</w:t>
+      </w:r>
+    </w:p>
+    <w:p>
+      <w:r>
+        <w:rPr>
+          <w:sz w:val="21"/>
+          <w:rFonts w:ascii="맑은 고딕" w:hAnsi="맑은 고딕" w:eastAsia="맑은 고딕"/>
+        </w:rPr>
+        <w:t xml:space="preserve">매번 바뀌는 날짜, 이름, 기한을 HTML 에 직접 쓰지 말고 </w:t>
+      </w:r>
+      <w:r>
+        <w:rPr>
+          <w:b/>
+          <w:sz w:val="21"/>
+          <w:rFonts w:ascii="맑은 고딕" w:hAnsi="맑은 고딕" w:eastAsia="맑은 고딕"/>
+        </w:rPr>
+        <w:t>&lt;?= 이름 ?&gt;</w:t>
+      </w:r>
+      <w:r>
+        <w:rPr>
+          <w:sz w:val="21"/>
+          <w:rFonts w:ascii="맑은 고딕" w:hAnsi="맑은 고딕" w:eastAsia="맑은 고딕"/>
+        </w:rPr>
+        <w:t xml:space="preserve"> 자리표로 써 두면, 발송하는 순간 Apps Script 가 실제 값으로 바꿔서 보냅니다. 이처럼 &lt;? ?&gt; 로 감싼 부분을 “스크립틀릿”이라고 부릅니다.</w:t>
+      </w:r>
+    </w:p>
+    <w:tbl>
+      <w:tblPr>
+        <w:tblStyle w:val="TableGrid"/>
+        <w:tblW w:type="auto" w:w="0"/>
+        <w:jc w:val="left"/>
+        <w:tblLayout w:type="fixed"/>
+        <w:tblLook w:firstColumn="1" w:firstRow="1" w:lastColumn="0" w:lastRow="0" w:noHBand="0" w:noVBand="1" w:val="04A0"/>
+        <w:tblLayout w:type="fixed"/>
+      </w:tblPr>
+      <w:tblGrid>
+        <w:gridCol w:w="2493"/>
+        <w:gridCol w:w="2493"/>
+        <w:gridCol w:w="2493"/>
+        <w:gridCol w:w="2493"/>
+      </w:tblGrid>
+      <w:tr>
+        <w:tc>
+          <w:tcPr>
+            <w:tcW w:type="dxa" w:w="1474"/>
+            <w:shd w:val="clear" w:color="auto" w:fill="1E3A5F"/>
+          </w:tcPr>
+          <w:p>
+            <w:pPr>
+              <w:spacing w:before="60" w:after="60" w:line="300" w:lineRule="auto"/>
+            </w:pPr>
+            <w:r/>
+            <w:r>
+              <w:rPr>
+                <w:b/>
+                <w:color w:val="FFFFFF"/>
+                <w:sz w:val="20"/>
+                <w:rFonts w:ascii="맑은 고딕" w:hAnsi="맑은 고딕" w:eastAsia="맑은 고딕"/>
+              </w:rPr>
+              <w:t>쓰는 법</w:t>
+            </w:r>
+          </w:p>
+        </w:tc>
+        <w:tc>
+          <w:tcPr>
+            <w:tcW w:type="dxa" w:w="2665"/>
+            <w:shd w:val="clear" w:color="auto" w:fill="1E3A5F"/>
+          </w:tcPr>
+          <w:p>
+            <w:pPr>
+              <w:spacing w:before="60" w:after="60" w:line="300" w:lineRule="auto"/>
+            </w:pPr>
+            <w:r/>
+            <w:r>
+              <w:rPr>
+                <w:b/>
+                <w:color w:val="FFFFFF"/>
+                <w:sz w:val="20"/>
+                <w:rFonts w:ascii="맑은 고딕" w:hAnsi="맑은 고딕" w:eastAsia="맑은 고딕"/>
+              </w:rPr>
+              <w:t>하는 일</w:t>
+            </w:r>
+          </w:p>
+        </w:tc>
+        <w:tc>
+          <w:tcPr>
+            <w:tcW w:type="dxa" w:w="2948"/>
+            <w:shd w:val="clear" w:color="auto" w:fill="1E3A5F"/>
+          </w:tcPr>
+          <w:p>
+            <w:pPr>
+              <w:spacing w:before="60" w:after="60" w:line="300" w:lineRule="auto"/>
+            </w:pPr>
+            <w:r/>
+            <w:r>
+              <w:rPr>
+                <w:b/>
+                <w:color w:val="FFFFFF"/>
+                <w:sz w:val="20"/>
+                <w:rFonts w:ascii="맑은 고딕" w:hAnsi="맑은 고딕" w:eastAsia="맑은 고딕"/>
+              </w:rPr>
+              <w:t>언제 쓰나</w:t>
+            </w:r>
+          </w:p>
+        </w:tc>
+        <w:tc>
+          <w:tcPr>
+            <w:tcW w:type="dxa" w:w="2551"/>
+            <w:shd w:val="clear" w:color="auto" w:fill="1E3A5F"/>
+          </w:tcPr>
+          <w:p>
+            <w:pPr>
+              <w:spacing w:before="60" w:after="60" w:line="300" w:lineRule="auto"/>
+            </w:pPr>
+            <w:r/>
+            <w:r>
+              <w:rPr>
+                <w:b/>
+                <w:color w:val="FFFFFF"/>
+                <w:sz w:val="20"/>
+                <w:rFonts w:ascii="맑은 고딕" w:hAnsi="맑은 고딕" w:eastAsia="맑은 고딕"/>
+              </w:rPr>
+              <w:t>예</w:t>
+            </w:r>
+          </w:p>
+        </w:tc>
+      </w:tr>
+      <w:tr>
+        <w:tc>
+          <w:tcPr>
+            <w:tcW w:type="dxa" w:w="1474"/>
+          </w:tcPr>
+          <w:p>
+            <w:pPr>
+              <w:spacing w:before="40" w:after="40" w:line="312" w:lineRule="auto"/>
+            </w:pPr>
+            <w:r/>
+            <w:r>
+              <w:rPr>
+                <w:sz w:val="19"/>
+                <w:rFonts w:ascii="Consolas" w:hAnsi="Consolas" w:eastAsia="Consolas"/>
+              </w:rPr>
+              <w:t>&lt;?= 값 ?&gt;</w:t>
+            </w:r>
+          </w:p>
+        </w:tc>
+        <w:tc>
+          <w:tcPr>
+            <w:tcW w:type="dxa" w:w="2665"/>
+          </w:tcPr>
+          <w:p>
+            <w:pPr>
+              <w:spacing w:before="40" w:after="40" w:line="312" w:lineRule="auto"/>
+            </w:pPr>
+            <w:r/>
+            <w:r>
+              <w:rPr>
+                <w:sz w:val="19"/>
+                <w:rFonts w:ascii="맑은 고딕" w:hAnsi="맑은 고딕" w:eastAsia="맑은 고딕"/>
+              </w:rPr>
+              <w:t>값을 글자로 출력 (특수문자는 안전하게 변환)</w:t>
+            </w:r>
+          </w:p>
+        </w:tc>
+        <w:tc>
+          <w:tcPr>
+            <w:tcW w:type="dxa" w:w="2948"/>
+          </w:tcPr>
+          <w:p>
+            <w:pPr>
+              <w:spacing w:before="40" w:after="40" w:line="312" w:lineRule="auto"/>
+            </w:pPr>
+            <w:r/>
+            <w:r>
+              <w:rPr>
+                <w:sz w:val="19"/>
+                <w:rFonts w:ascii="맑은 고딕" w:hAnsi="맑은 고딕" w:eastAsia="맑은 고딕"/>
+              </w:rPr>
+              <w:t>날짜, 이름, 기한 같은 일반 값</w:t>
+            </w:r>
+          </w:p>
+        </w:tc>
+        <w:tc>
+          <w:tcPr>
+            <w:tcW w:type="dxa" w:w="2551"/>
+          </w:tcPr>
+          <w:p>
+            <w:pPr>
+              <w:spacing w:before="40" w:after="40" w:line="312" w:lineRule="auto"/>
+            </w:pPr>
+            <w:r/>
+            <w:r>
+              <w:rPr>
+                <w:sz w:val="19"/>
+                <w:rFonts w:ascii="Consolas" w:hAnsi="Consolas" w:eastAsia="Consolas"/>
+              </w:rPr>
+              <w:t>&lt;?= vars.date ?&gt;</w:t>
+            </w:r>
+          </w:p>
+        </w:tc>
+      </w:tr>
+      <w:tr>
+        <w:tc>
+          <w:tcPr>
+            <w:tcW w:type="dxa" w:w="1474"/>
+            <w:shd w:val="clear" w:color="auto" w:fill="F2F5F8"/>
+          </w:tcPr>
+          <w:p>
+            <w:pPr>
+              <w:spacing w:before="40" w:after="40" w:line="312" w:lineRule="auto"/>
+            </w:pPr>
+            <w:r/>
+            <w:r>
+              <w:rPr>
+                <w:sz w:val="19"/>
+                <w:rFonts w:ascii="Consolas" w:hAnsi="Consolas" w:eastAsia="Consolas"/>
+              </w:rPr>
+              <w:t>&lt;?!= 값 ?&gt;</w:t>
+            </w:r>
+          </w:p>
+        </w:tc>
+        <w:tc>
+          <w:tcPr>
+            <w:tcW w:type="dxa" w:w="2665"/>
+            <w:shd w:val="clear" w:color="auto" w:fill="F2F5F8"/>
+          </w:tcPr>
+          <w:p>
+            <w:pPr>
+              <w:spacing w:before="40" w:after="40" w:line="312" w:lineRule="auto"/>
+            </w:pPr>
+            <w:r/>
+            <w:r>
+              <w:rPr>
+                <w:sz w:val="19"/>
+                <w:rFonts w:ascii="맑은 고딕" w:hAnsi="맑은 고딕" w:eastAsia="맑은 고딕"/>
+              </w:rPr>
+              <w:t>값을 HTML 그대로 출력</w:t>
+            </w:r>
+          </w:p>
+        </w:tc>
+        <w:tc>
+          <w:tcPr>
+            <w:tcW w:type="dxa" w:w="2948"/>
+            <w:shd w:val="clear" w:color="auto" w:fill="F2F5F8"/>
+          </w:tcPr>
+          <w:p>
+            <w:pPr>
+              <w:spacing w:before="40" w:after="40" w:line="312" w:lineRule="auto"/>
+            </w:pPr>
+            <w:r/>
+            <w:r>
+              <w:rPr>
+                <w:sz w:val="19"/>
+                <w:rFonts w:ascii="맑은 고딕" w:hAnsi="맑은 고딕" w:eastAsia="맑은 고딕"/>
+              </w:rPr>
+              <w:t>링크처럼 이미 HTML 인 값 (linkHtml, include 결과)</w:t>
+            </w:r>
+          </w:p>
+        </w:tc>
+        <w:tc>
+          <w:tcPr>
+            <w:tcW w:type="dxa" w:w="2551"/>
+            <w:shd w:val="clear" w:color="auto" w:fill="F2F5F8"/>
+          </w:tcPr>
+          <w:p>
+            <w:pPr>
+              <w:spacing w:before="40" w:after="40" w:line="312" w:lineRule="auto"/>
+            </w:pPr>
+            <w:r/>
+            <w:r>
+              <w:rPr>
+                <w:sz w:val="19"/>
+                <w:rFonts w:ascii="Consolas" w:hAnsi="Consolas" w:eastAsia="Consolas"/>
+              </w:rPr>
+              <w:t>&lt;?!= linkHtml(links.a, '링크') ?&gt;</w:t>
+            </w:r>
+          </w:p>
+        </w:tc>
+      </w:tr>
+      <w:tr>
+        <w:tc>
+          <w:tcPr>
+            <w:tcW w:type="dxa" w:w="1474"/>
+          </w:tcPr>
+          <w:p>
+            <w:pPr>
+              <w:spacing w:before="40" w:after="40" w:line="312" w:lineRule="auto"/>
+            </w:pPr>
+            <w:r/>
+            <w:r>
+              <w:rPr>
+                <w:sz w:val="19"/>
+                <w:rFonts w:ascii="Consolas" w:hAnsi="Consolas" w:eastAsia="Consolas"/>
+              </w:rPr>
+              <w:t>&lt;? 코드 ?&gt;</w:t>
+            </w:r>
+          </w:p>
+        </w:tc>
+        <w:tc>
+          <w:tcPr>
+            <w:tcW w:type="dxa" w:w="2665"/>
+          </w:tcPr>
+          <w:p>
+            <w:pPr>
+              <w:spacing w:before="40" w:after="40" w:line="312" w:lineRule="auto"/>
+            </w:pPr>
+            <w:r/>
+            <w:r>
+              <w:rPr>
+                <w:sz w:val="19"/>
+                <w:rFonts w:ascii="맑은 고딕" w:hAnsi="맑은 고딕" w:eastAsia="맑은 고딕"/>
+              </w:rPr>
+              <w:t>아무것도 출력하지 않고 코드만 실행</w:t>
+            </w:r>
+          </w:p>
+        </w:tc>
+        <w:tc>
+          <w:tcPr>
+            <w:tcW w:type="dxa" w:w="2948"/>
+          </w:tcPr>
+          <w:p>
+            <w:pPr>
+              <w:spacing w:before="40" w:after="40" w:line="312" w:lineRule="auto"/>
+            </w:pPr>
+            <w:r/>
+            <w:r>
+              <w:rPr>
+                <w:sz w:val="19"/>
+                <w:rFonts w:ascii="맑은 고딕" w:hAnsi="맑은 고딕" w:eastAsia="맑은 고딕"/>
+              </w:rPr>
+              <w:t>조건문 if, 반복문 for, 주석</w:t>
+            </w:r>
+          </w:p>
+        </w:tc>
+        <w:tc>
+          <w:tcPr>
+            <w:tcW w:type="dxa" w:w="2551"/>
+          </w:tcPr>
+          <w:p>
+            <w:pPr>
+              <w:spacing w:before="40" w:after="40" w:line="312" w:lineRule="auto"/>
+            </w:pPr>
+            <w:r/>
+            <w:r>
+              <w:rPr>
+                <w:sz w:val="19"/>
+                <w:rFonts w:ascii="Consolas" w:hAnsi="Consolas" w:eastAsia="Consolas"/>
+              </w:rPr>
+              <w:t>&lt;? if (job.deadline) { ?&gt;</w:t>
+            </w:r>
+          </w:p>
+        </w:tc>
+      </w:tr>
+    </w:tbl>
+    <w:p>
+      <w:pPr>
+        <w:spacing w:before="0" w:after="120" w:line="240" w:lineRule="auto"/>
+      </w:pPr>
+      <w:r>
+        <w:rPr>
+          <w:sz w:val="2"/>
+          <w:rFonts w:ascii="맑은 고딕" w:hAnsi="맑은 고딕" w:eastAsia="맑은 고딕"/>
+        </w:rPr>
+      </w:r>
+    </w:p>
+    <w:p>
+      <w:pPr>
+        <w:pStyle w:val="Heading3"/>
+        <w:spacing w:before="200" w:after="60"/>
+      </w:pPr>
+      <w:r>
+        <w:rPr>
+          <w:b/>
+          <w:color w:val="1A1A1A"/>
+          <w:sz w:val="21"/>
+          <w:rFonts w:ascii="맑은 고딕" w:hAnsi="맑은 고딕" w:eastAsia="맑은 고딕"/>
+        </w:rPr>
+        <w:t>쓸 수 있는 값</w:t>
       </w:r>
     </w:p>
     <w:tbl>
@@ -10970,7 +12721,7 @@
       <w:tr>
         <w:tc>
           <w:tcPr>
-            <w:tcW w:type="dxa" w:w="1814"/>
+            <w:tcW w:type="dxa" w:w="1984"/>
             <w:shd w:val="clear" w:color="auto" w:fill="1E3A5F"/>
           </w:tcPr>
           <w:p>
@@ -10985,13 +12736,13 @@
                 <w:sz w:val="20"/>
                 <w:rFonts w:ascii="맑은 고딕" w:hAnsi="맑은 고딕" w:eastAsia="맑은 고딕"/>
               </w:rPr>
-              <w:t>쓰는 법</w:t>
-            </w:r>
-          </w:p>
-        </w:tc>
-        <w:tc>
-          <w:tcPr>
-            <w:tcW w:type="dxa" w:w="4706"/>
+              <w:t>값</w:t>
+            </w:r>
+          </w:p>
+        </w:tc>
+        <w:tc>
+          <w:tcPr>
+            <w:tcW w:type="dxa" w:w="3969"/>
             <w:shd w:val="clear" w:color="auto" w:fill="1E3A5F"/>
           </w:tcPr>
           <w:p>
@@ -11006,13 +12757,13 @@
                 <w:sz w:val="20"/>
                 <w:rFonts w:ascii="맑은 고딕" w:hAnsi="맑은 고딕" w:eastAsia="맑은 고딕"/>
               </w:rPr>
-              <w:t>의미</w:t>
-            </w:r>
-          </w:p>
-        </w:tc>
-        <w:tc>
-          <w:tcPr>
-            <w:tcW w:type="dxa" w:w="3118"/>
+              <w:t>내용</w:t>
+            </w:r>
+          </w:p>
+        </w:tc>
+        <w:tc>
+          <w:tcPr>
+            <w:tcW w:type="dxa" w:w="3685"/>
             <w:shd w:val="clear" w:color="auto" w:fill="1E3A5F"/>
           </w:tcPr>
           <w:p>
@@ -11027,7 +12778,7 @@
                 <w:sz w:val="20"/>
                 <w:rFonts w:ascii="맑은 고딕" w:hAnsi="맑은 고딕" w:eastAsia="맑은 고딕"/>
               </w:rPr>
-              <w:t>언제</w:t>
+              <w:t>예</w:t>
             </w:r>
           </w:p>
         </w:tc>
@@ -11035,7 +12786,7 @@
       <w:tr>
         <w:tc>
           <w:tcPr>
-            <w:tcW w:type="dxa" w:w="1814"/>
+            <w:tcW w:type="dxa" w:w="1984"/>
           </w:tcPr>
           <w:p>
             <w:pPr>
@@ -11047,13 +12798,13 @@
                 <w:sz w:val="19"/>
                 <w:rFonts w:ascii="Consolas" w:hAnsi="Consolas" w:eastAsia="Consolas"/>
               </w:rPr>
-              <w:t>&lt;?= 값 ?&gt;</w:t>
-            </w:r>
-          </w:p>
-        </w:tc>
-        <w:tc>
-          <w:tcPr>
-            <w:tcW w:type="dxa" w:w="4706"/>
+              <w:t>vars.date</w:t>
+            </w:r>
+          </w:p>
+        </w:tc>
+        <w:tc>
+          <w:tcPr>
+            <w:tcW w:type="dxa" w:w="3969"/>
           </w:tcPr>
           <w:p>
             <w:pPr>
@@ -11065,13 +12816,53 @@
                 <w:sz w:val="19"/>
                 <w:rFonts w:ascii="맑은 고딕" w:hAnsi="맑은 고딕" w:eastAsia="맑은 고딕"/>
               </w:rPr>
-              <w:t>값을 글자로 출력. &lt; &gt; &amp; 같은 특수문자는 안전하게 바뀜</w:t>
-            </w:r>
-          </w:p>
-        </w:tc>
-        <w:tc>
-          <w:tcPr>
-            <w:tcW w:type="dxa" w:w="3118"/>
+              <w:t>발송일 YYMMDD</w:t>
+            </w:r>
+          </w:p>
+        </w:tc>
+        <w:tc>
+          <w:tcPr>
+            <w:tcW w:type="dxa" w:w="3685"/>
+          </w:tcPr>
+          <w:p>
+            <w:pPr>
+              <w:spacing w:before="40" w:after="40" w:line="312" w:lineRule="auto"/>
+            </w:pPr>
+            <w:r/>
+            <w:r>
+              <w:rPr>
+                <w:sz w:val="19"/>
+                <w:rFonts w:ascii="Consolas" w:hAnsi="Consolas" w:eastAsia="Consolas"/>
+              </w:rPr>
+              <w:t>260915</w:t>
+            </w:r>
+          </w:p>
+        </w:tc>
+      </w:tr>
+      <w:tr>
+        <w:tc>
+          <w:tcPr>
+            <w:tcW w:type="dxa" w:w="1984"/>
+            <w:shd w:val="clear" w:color="auto" w:fill="F2F5F8"/>
+          </w:tcPr>
+          <w:p>
+            <w:pPr>
+              <w:spacing w:before="40" w:after="40" w:line="312" w:lineRule="auto"/>
+            </w:pPr>
+            <w:r/>
+            <w:r>
+              <w:rPr>
+                <w:sz w:val="19"/>
+                <w:rFonts w:ascii="Consolas" w:hAnsi="Consolas" w:eastAsia="Consolas"/>
+              </w:rPr>
+              <w:t>vars.today</w:t>
+            </w:r>
+          </w:p>
+        </w:tc>
+        <w:tc>
+          <w:tcPr>
+            <w:tcW w:type="dxa" w:w="3969"/>
+            <w:shd w:val="clear" w:color="auto" w:fill="F2F5F8"/>
           </w:tcPr>
           <w:p>
             <w:pPr>
@@ -11083,7 +12874,26 @@
                 <w:sz w:val="19"/>
                 <w:rFonts w:ascii="맑은 고딕" w:hAnsi="맑은 고딕" w:eastAsia="맑은 고딕"/>
               </w:rPr>
-              <w:t>날짜, 이름 등 일반 값</w:t>
+              <w:t>발송일 YYYY-MM-DD</w:t>
+            </w:r>
+          </w:p>
+        </w:tc>
+        <w:tc>
+          <w:tcPr>
+            <w:tcW w:type="dxa" w:w="3685"/>
+            <w:shd w:val="clear" w:color="auto" w:fill="F2F5F8"/>
+          </w:tcPr>
+          <w:p>
+            <w:pPr>
+              <w:spacing w:before="40" w:after="40" w:line="312" w:lineRule="auto"/>
+            </w:pPr>
+            <w:r/>
+            <w:r>
+              <w:rPr>
+                <w:sz w:val="19"/>
+                <w:rFonts w:ascii="Consolas" w:hAnsi="Consolas" w:eastAsia="Consolas"/>
+              </w:rPr>
+              <w:t>2026-09-15</w:t>
             </w:r>
           </w:p>
         </w:tc>
@@ -11091,8 +12901,7 @@
       <w:tr>
         <w:tc>
           <w:tcPr>
-            <w:tcW w:type="dxa" w:w="1814"/>
-            <w:shd w:val="clear" w:color="auto" w:fill="F2F5F8"/>
+            <w:tcW w:type="dxa" w:w="1984"/>
           </w:tcPr>
           <w:p>
             <w:pPr>
@@ -11104,14 +12913,13 @@
                 <w:sz w:val="19"/>
                 <w:rFonts w:ascii="Consolas" w:hAnsi="Consolas" w:eastAsia="Consolas"/>
               </w:rPr>
-              <w:t>&lt;?!= 값 ?&gt;</w:t>
-            </w:r>
-          </w:p>
-        </w:tc>
-        <w:tc>
-          <w:tcPr>
-            <w:tcW w:type="dxa" w:w="4706"/>
-            <w:shd w:val="clear" w:color="auto" w:fill="F2F5F8"/>
+              <w:t>links.이름</w:t>
+            </w:r>
+          </w:p>
+        </w:tc>
+        <w:tc>
+          <w:tcPr>
+            <w:tcW w:type="dxa" w:w="3969"/>
           </w:tcPr>
           <w:p>
             <w:pPr>
@@ -11123,13 +12931,52 @@
                 <w:sz w:val="19"/>
                 <w:rFonts w:ascii="맑은 고딕" w:hAnsi="맑은 고딕" w:eastAsia="맑은 고딕"/>
               </w:rPr>
-              <w:t>값을 HTML 그대로 출력</w:t>
-            </w:r>
-          </w:p>
-        </w:tc>
-        <w:tc>
-          <w:tcPr>
-            <w:tcW w:type="dxa" w:w="3118"/>
+              <w:t>Config.gs links 의 주소</w:t>
+            </w:r>
+          </w:p>
+        </w:tc>
+        <w:tc>
+          <w:tcPr>
+            <w:tcW w:type="dxa" w:w="3685"/>
+          </w:tcPr>
+          <w:p>
+            <w:pPr>
+              <w:spacing w:before="40" w:after="40" w:line="312" w:lineRule="auto"/>
+            </w:pPr>
+            <w:r/>
+            <w:r>
+              <w:rPr>
+                <w:sz w:val="19"/>
+                <w:rFonts w:ascii="Consolas" w:hAnsi="Consolas" w:eastAsia="Consolas"/>
+              </w:rPr>
+              <w:t>&lt;?!= linkHtml(links.attach1, '링크') ?&gt;</w:t>
+            </w:r>
+          </w:p>
+        </w:tc>
+      </w:tr>
+      <w:tr>
+        <w:tc>
+          <w:tcPr>
+            <w:tcW w:type="dxa" w:w="1984"/>
+            <w:shd w:val="clear" w:color="auto" w:fill="F2F5F8"/>
+          </w:tcPr>
+          <w:p>
+            <w:pPr>
+              <w:spacing w:before="40" w:after="40" w:line="312" w:lineRule="auto"/>
+            </w:pPr>
+            <w:r/>
+            <w:r>
+              <w:rPr>
+                <w:sz w:val="19"/>
+                <w:rFonts w:ascii="Consolas" w:hAnsi="Consolas" w:eastAsia="Consolas"/>
+              </w:rPr>
+              <w:t>job.항목</w:t>
+            </w:r>
+          </w:p>
+        </w:tc>
+        <w:tc>
+          <w:tcPr>
+            <w:tcW w:type="dxa" w:w="3969"/>
             <w:shd w:val="clear" w:color="auto" w:fill="F2F5F8"/>
           </w:tcPr>
           <w:p>
@@ -11142,7 +12989,26 @@
                 <w:sz w:val="19"/>
                 <w:rFonts w:ascii="맑은 고딕" w:hAnsi="맑은 고딕" w:eastAsia="맑은 고딕"/>
               </w:rPr>
-              <w:t>linkHtml(…), include(…) 결과에만</w:t>
+              <w:t>Config.gs 메일 묶음의 아무 항목 (직접 추가 가능)</w:t>
+            </w:r>
+          </w:p>
+        </w:tc>
+        <w:tc>
+          <w:tcPr>
+            <w:tcW w:type="dxa" w:w="3685"/>
+            <w:shd w:val="clear" w:color="auto" w:fill="F2F5F8"/>
+          </w:tcPr>
+          <w:p>
+            <w:pPr>
+              <w:spacing w:before="40" w:after="40" w:line="312" w:lineRule="auto"/>
+            </w:pPr>
+            <w:r/>
+            <w:r>
+              <w:rPr>
+                <w:sz w:val="19"/>
+                <w:rFonts w:ascii="Consolas" w:hAnsi="Consolas" w:eastAsia="Consolas"/>
+              </w:rPr>
+              <w:t>job.subject, job.deadline</w:t>
             </w:r>
           </w:p>
         </w:tc>
@@ -11150,7 +13016,7 @@
       <w:tr>
         <w:tc>
           <w:tcPr>
-            <w:tcW w:type="dxa" w:w="1814"/>
+            <w:tcW w:type="dxa" w:w="1984"/>
           </w:tcPr>
           <w:p>
             <w:pPr>
@@ -11162,13 +13028,13 @@
                 <w:sz w:val="19"/>
                 <w:rFonts w:ascii="Consolas" w:hAnsi="Consolas" w:eastAsia="Consolas"/>
               </w:rPr>
-              <w:t>&lt;? 코드 ?&gt;</w:t>
-            </w:r>
-          </w:p>
-        </w:tc>
-        <w:tc>
-          <w:tcPr>
-            <w:tcW w:type="dxa" w:w="4706"/>
+              <w:t>sender.항목</w:t>
+            </w:r>
+          </w:p>
+        </w:tc>
+        <w:tc>
+          <w:tcPr>
+            <w:tcW w:type="dxa" w:w="3969"/>
           </w:tcPr>
           <w:p>
             <w:pPr>
@@ -11180,13 +13046,13 @@
                 <w:sz w:val="19"/>
                 <w:rFonts w:ascii="맑은 고딕" w:hAnsi="맑은 고딕" w:eastAsia="맑은 고딕"/>
               </w:rPr>
-              <w:t>출력 없이 코드만 실행</w:t>
-            </w:r>
-          </w:p>
-        </w:tc>
-        <w:tc>
-          <w:tcPr>
-            <w:tcW w:type="dxa" w:w="3118"/>
+              <w:t>SENDER 정보 (name, dept, email, phone)</w:t>
+            </w:r>
+          </w:p>
+        </w:tc>
+        <w:tc>
+          <w:tcPr>
+            <w:tcW w:type="dxa" w:w="3685"/>
           </w:tcPr>
           <w:p>
             <w:pPr>
@@ -11196,9 +13062,9 @@
             <w:r>
               <w:rPr>
                 <w:sz w:val="19"/>
-                <w:rFonts w:ascii="맑은 고딕" w:hAnsi="맑은 고딕" w:eastAsia="맑은 고딕"/>
-              </w:rPr>
-              <w:t>조건문(if), 주석</w:t>
+                <w:rFonts w:ascii="Consolas" w:hAnsi="Consolas" w:eastAsia="Consolas"/>
+              </w:rPr>
+              <w:t>sender.name</w:t>
             </w:r>
           </w:p>
         </w:tc>
@@ -11213,6 +13079,95 @@
           <w:sz w:val="2"/>
           <w:rFonts w:ascii="맑은 고딕" w:hAnsi="맑은 고딕" w:eastAsia="맑은 고딕"/>
         </w:rPr>
+      </w:r>
+    </w:p>
+    <w:p>
+      <w:pPr>
+        <w:spacing w:before="160" w:after="40"/>
+        <w:jc w:val="center"/>
+      </w:pPr>
+      <w:r>
+        <w:drawing>
+          <wp:inline xmlns:a="http://schemas.openxmlformats.org/drawingml/2006/main" xmlns:pic="http://schemas.openxmlformats.org/drawingml/2006/picture">
+            <wp:extent cx="5940000" cy="2174192"/>
+            <wp:docPr id="5" name="Picture 5"/>
+            <wp:cNvGraphicFramePr>
+              <a:graphicFrameLocks noChangeAspect="1"/>
+            </wp:cNvGraphicFramePr>
+            <a:graphic>
+              <a:graphicData uri="http://schemas.openxmlformats.org/drawingml/2006/picture">
+                <pic:pic>
+                  <pic:nvPicPr>
+                    <pic:cNvPr id="0" name="cmp_4_values.png"/>
+                    <pic:cNvPicPr/>
+                  </pic:nvPicPr>
+                  <pic:blipFill>
+                    <a:blip r:embed="rId13"/>
+                    <a:stretch>
+                      <a:fillRect/>
+                    </a:stretch>
+                  </pic:blipFill>
+                  <pic:spPr>
+                    <a:xfrm>
+                      <a:off x="0" y="0"/>
+                      <a:ext cx="5940000" cy="2174192"/>
+                    </a:xfrm>
+                    <a:prstGeom prst="rect"/>
+                  </pic:spPr>
+                </pic:pic>
+              </a:graphicData>
+            </a:graphic>
+          </wp:inline>
+        </w:drawing>
+      </w:r>
+    </w:p>
+    <w:p>
+      <w:pPr>
+        <w:spacing w:before="0" w:after="240"/>
+        <w:jc w:val="center"/>
+      </w:pPr>
+      <w:r>
+        <w:rPr>
+          <w:color w:val="6B7280"/>
+          <w:sz w:val="18"/>
+          <w:rFonts w:ascii="맑은 고딕" w:hAnsi="맑은 고딕" w:eastAsia="맑은 고딕"/>
+        </w:rPr>
+        <w:t>그림 5. &lt;?= … ?&gt; 자리에 실제 값이 들어간다 (날짜는 발송하는 날마다 자동으로 바뀐다)</w:t>
+      </w:r>
+    </w:p>
+    <w:p>
+      <w:pPr>
+        <w:spacing w:before="160" w:after="160" w:line="336" w:lineRule="auto"/>
+        <w:ind w:left="142" w:right="57"/>
+        <w:shd w:val="clear" w:color="auto" w:fill="EAF2F8"/>
+        <w:pBdr>
+          <w:left w:val="single" w:sz="20" w:space="6" w:color="0F5C8C"/>
+        </w:pBdr>
+      </w:pPr>
+      <w:r>
+        <w:rPr>
+          <w:b/>
+          <w:color w:val="0F5C8C"/>
+          <w:sz w:val="21"/>
+          <w:rFonts w:ascii="맑은 고딕" w:hAnsi="맑은 고딕" w:eastAsia="맑은 고딕"/>
+        </w:rPr>
+        <w:t xml:space="preserve">★ </w:t>
+      </w:r>
+      <w:r>
+        <w:rPr>
+          <w:b/>
+          <w:color w:val="0F5C8C"/>
+          <w:sz w:val="21"/>
+          <w:rFonts w:ascii="맑은 고딕" w:hAnsi="맑은 고딕" w:eastAsia="맑은 고딕"/>
+        </w:rPr>
+        <w:t xml:space="preserve">나만의 값 만들기  </w:t>
+      </w:r>
+      <w:r>
+        <w:rPr>
+          <w:sz w:val="20"/>
+          <w:rFonts w:ascii="맑은 고딕" w:hAnsi="맑은 고딕" w:eastAsia="맑은 고딕"/>
+        </w:rPr>
+        <w:t>Config.gs 의 메일 묶음에 deadline: '10월 31일' 을 한 줄 추가하면, 본문에서 &lt;?= job.deadline ?&gt; 로 꺼내 쓸 수 있습니다. 기한이 바뀌면 HTML 은 그대로 두고 Config.gs 의 한 줄만 고치면 됩니다.</w:t>
       </w:r>
     </w:p>
     <w:p>
@@ -11230,7 +13185,1247 @@
           <w:sz w:val="24"/>
           <w:rFonts w:ascii="맑은 고딕" w:hAnsi="맑은 고딕" w:eastAsia="맑은 고딕"/>
         </w:rPr>
-        <w:t>■ 7-2. 본문에서 쓸 수 있는 값</w:t>
+        <w:t>■ 7-4. 링크 넣기</w:t>
+      </w:r>
+    </w:p>
+    <w:p>
+      <w:pPr>
+        <w:spacing w:after="60"/>
+        <w:ind w:left="283" w:hanging="283"/>
+      </w:pPr>
+      <w:r>
+        <w:rPr>
+          <w:b/>
+          <w:color w:val="0F5C8C"/>
+          <w:sz w:val="22"/>
+          <w:rFonts w:ascii="맑은 고딕" w:hAnsi="맑은 고딕" w:eastAsia="맑은 고딕"/>
+        </w:rPr>
+        <w:t xml:space="preserve">① </w:t>
+      </w:r>
+      <w:r>
+        <w:rPr>
+          <w:sz w:val="21"/>
+          <w:rFonts w:ascii="맑은 고딕" w:hAnsi="맑은 고딕" w:eastAsia="맑은 고딕"/>
+        </w:rPr>
+        <w:t>Config.gs 의 links 에 주소를 넣습니다.   links: { sheet: 'https://docs.google.com/…' }</w:t>
+      </w:r>
+    </w:p>
+    <w:p>
+      <w:pPr>
+        <w:spacing w:after="60"/>
+        <w:ind w:left="283" w:hanging="283"/>
+      </w:pPr>
+      <w:r>
+        <w:rPr>
+          <w:b/>
+          <w:color w:val="0F5C8C"/>
+          <w:sz w:val="22"/>
+          <w:rFonts w:ascii="맑은 고딕" w:hAnsi="맑은 고딕" w:eastAsia="맑은 고딕"/>
+        </w:rPr>
+        <w:t xml:space="preserve">② </w:t>
+      </w:r>
+      <w:r>
+        <w:rPr>
+          <w:sz w:val="21"/>
+          <w:rFonts w:ascii="맑은 고딕" w:hAnsi="맑은 고딕" w:eastAsia="맑은 고딕"/>
+        </w:rPr>
+        <w:t>본문 HTML 에는 이렇게 씁니다.   &lt;?!= linkHtml(links.sheet, '링크') ?&gt;</w:t>
+      </w:r>
+    </w:p>
+    <w:p>
+      <w:pPr>
+        <w:spacing w:after="60"/>
+        <w:ind w:left="283" w:hanging="283"/>
+      </w:pPr>
+      <w:r>
+        <w:rPr>
+          <w:b/>
+          <w:color w:val="0F5C8C"/>
+          <w:sz w:val="22"/>
+          <w:rFonts w:ascii="맑은 고딕" w:hAnsi="맑은 고딕" w:eastAsia="맑은 고딕"/>
+        </w:rPr>
+        <w:t xml:space="preserve">③ </w:t>
+      </w:r>
+      <w:r>
+        <w:rPr>
+          <w:sz w:val="21"/>
+          <w:rFonts w:ascii="맑은 고딕" w:hAnsi="맑은 고딕" w:eastAsia="맑은 고딕"/>
+        </w:rPr>
+        <w:t>두 번째 칸이 화면에 보일 글자입니다. '링크' 대신 '여기를 클릭', '점검표 열기' 같은 글을 써도 됩니다.</w:t>
+      </w:r>
+    </w:p>
+    <w:p>
+      <w:pPr>
+        <w:spacing w:before="160" w:after="40"/>
+        <w:jc w:val="center"/>
+      </w:pPr>
+      <w:r>
+        <w:drawing>
+          <wp:inline xmlns:a="http://schemas.openxmlformats.org/drawingml/2006/main" xmlns:pic="http://schemas.openxmlformats.org/drawingml/2006/picture">
+            <wp:extent cx="5940000" cy="3468808"/>
+            <wp:docPr id="6" name="Picture 6"/>
+            <wp:cNvGraphicFramePr>
+              <a:graphicFrameLocks noChangeAspect="1"/>
+            </wp:cNvGraphicFramePr>
+            <a:graphic>
+              <a:graphicData uri="http://schemas.openxmlformats.org/drawingml/2006/picture">
+                <pic:pic>
+                  <pic:nvPicPr>
+                    <pic:cNvPr id="0" name="cmp_5_link.png"/>
+                    <pic:cNvPicPr/>
+                  </pic:nvPicPr>
+                  <pic:blipFill>
+                    <a:blip r:embed="rId14"/>
+                    <a:stretch>
+                      <a:fillRect/>
+                    </a:stretch>
+                  </pic:blipFill>
+                  <pic:spPr>
+                    <a:xfrm>
+                      <a:off x="0" y="0"/>
+                      <a:ext cx="5940000" cy="3468808"/>
+                    </a:xfrm>
+                    <a:prstGeom prst="rect"/>
+                  </pic:spPr>
+                </pic:pic>
+              </a:graphicData>
+            </a:graphic>
+          </wp:inline>
+        </w:drawing>
+      </w:r>
+    </w:p>
+    <w:p>
+      <w:pPr>
+        <w:spacing w:before="0" w:after="240"/>
+        <w:jc w:val="center"/>
+      </w:pPr>
+      <w:r>
+        <w:rPr>
+          <w:color w:val="6B7280"/>
+          <w:sz w:val="18"/>
+          <w:rFonts w:ascii="맑은 고딕" w:hAnsi="맑은 고딕" w:eastAsia="맑은 고딕"/>
+        </w:rPr>
+        <w:t>그림 6. linkHtml 로 넣은 링크 / 링크 칸이 빈 경우 / 직접 쓴 링크</w:t>
+      </w:r>
+    </w:p>
+    <w:p>
+      <w:r>
+        <w:rPr>
+          <w:sz w:val="21"/>
+          <w:rFonts w:ascii="맑은 고딕" w:hAnsi="맑은 고딕" w:eastAsia="맑은 고딕"/>
+        </w:rPr>
+        <w:t xml:space="preserve">링크 칸이 비어 있으면 </w:t>
+      </w:r>
+      <w:r>
+        <w:rPr>
+          <w:b/>
+          <w:sz w:val="21"/>
+          <w:rFonts w:ascii="맑은 고딕" w:hAnsi="맑은 고딕" w:eastAsia="맑은 고딕"/>
+        </w:rPr>
+        <w:t>실제 발송은 막히고 오류 알림</w:t>
+      </w:r>
+      <w:r>
+        <w:rPr>
+          <w:sz w:val="21"/>
+          <w:rFonts w:ascii="맑은 고딕" w:hAnsi="맑은 고딕" w:eastAsia="맑은 고딕"/>
+        </w:rPr>
+        <w:t xml:space="preserve"> 이 옵니다. 테스트 발송(testSendToMe)에서는 위 ②처럼 빨간 “(링크 미입력)” 으로 보여서, 빠뜨린 곳을 눈으로 찾을 수 있습니다.</w:t>
+      </w:r>
+    </w:p>
+    <w:p>
+      <w:pPr>
+        <w:pStyle w:val="Heading2"/>
+        <w:spacing w:before="280" w:after="100" w:line="312" w:lineRule="auto"/>
+        <w:pBdr>
+          <w:bottom w:val="single" w:sz="4" w:space="3" w:color="C9D2DC"/>
+        </w:pBdr>
+      </w:pPr>
+      <w:r>
+        <w:rPr>
+          <w:b/>
+          <w:color w:val="0F5C8C"/>
+          <w:sz w:val="24"/>
+          <w:rFonts w:ascii="맑은 고딕" w:hAnsi="맑은 고딕" w:eastAsia="맑은 고딕"/>
+        </w:rPr>
+        <w:t>■ 7-5. (선택) 조건과 반복 — 상황에 따라 내용 바꾸기</w:t>
+      </w:r>
+    </w:p>
+    <w:p>
+      <w:r>
+        <w:rPr>
+          <w:sz w:val="21"/>
+          <w:rFonts w:ascii="맑은 고딕" w:hAnsi="맑은 고딕" w:eastAsia="맑은 고딕"/>
+        </w:rPr>
+        <w:t>꼭 필요한 기능은 아닙니다. 처음에는 건너뛰어도 됩니다. 메일마다 내용이 달라질 때 유용합니다.</w:t>
+      </w:r>
+    </w:p>
+    <w:p>
+      <w:pPr>
+        <w:spacing w:after="60"/>
+        <w:ind w:left="283" w:hanging="238"/>
+      </w:pPr>
+      <w:r>
+        <w:rPr>
+          <w:color w:val="0F5C8C"/>
+          <w:sz w:val="21"/>
+          <w:rFonts w:ascii="맑은 고딕" w:hAnsi="맑은 고딕" w:eastAsia="맑은 고딕"/>
+        </w:rPr>
+        <w:t xml:space="preserve">· </w:t>
+      </w:r>
+      <w:r>
+        <w:rPr>
+          <w:sz w:val="21"/>
+          <w:rFonts w:ascii="맑은 고딕" w:hAnsi="맑은 고딕" w:eastAsia="맑은 고딕"/>
+        </w:rPr>
+        <w:t>조건: 값이 있을 때만 그 줄을 보여 줍니다. 값이 없으면 줄이 통째로 사라집니다.</w:t>
+      </w:r>
+    </w:p>
+    <w:p>
+      <w:pPr>
+        <w:spacing w:after="60"/>
+        <w:ind w:left="283" w:hanging="238"/>
+      </w:pPr>
+      <w:r>
+        <w:rPr>
+          <w:color w:val="0F5C8C"/>
+          <w:sz w:val="21"/>
+          <w:rFonts w:ascii="맑은 고딕" w:hAnsi="맑은 고딕" w:eastAsia="맑은 고딕"/>
+        </w:rPr>
+        <w:t xml:space="preserve">· </w:t>
+      </w:r>
+      <w:r>
+        <w:rPr>
+          <w:sz w:val="21"/>
+          <w:rFonts w:ascii="맑은 고딕" w:hAnsi="맑은 고딕" w:eastAsia="맑은 고딕"/>
+        </w:rPr>
+        <w:t>반복: 목록의 개수만큼 같은 줄을 찍습니다. 목록이 늘어나도 HTML 을 고칠 필요가 없습니다.</w:t>
+      </w:r>
+    </w:p>
+    <w:p>
+      <w:pPr>
+        <w:spacing w:before="160" w:after="40"/>
+        <w:jc w:val="center"/>
+      </w:pPr>
+      <w:r>
+        <w:drawing>
+          <wp:inline xmlns:a="http://schemas.openxmlformats.org/drawingml/2006/main" xmlns:pic="http://schemas.openxmlformats.org/drawingml/2006/picture">
+            <wp:extent cx="5940000" cy="3986654"/>
+            <wp:docPr id="7" name="Picture 7"/>
+            <wp:cNvGraphicFramePr>
+              <a:graphicFrameLocks noChangeAspect="1"/>
+            </wp:cNvGraphicFramePr>
+            <a:graphic>
+              <a:graphicData uri="http://schemas.openxmlformats.org/drawingml/2006/picture">
+                <pic:pic>
+                  <pic:nvPicPr>
+                    <pic:cNvPr id="0" name="cmp_6_logic.png"/>
+                    <pic:cNvPicPr/>
+                  </pic:nvPicPr>
+                  <pic:blipFill>
+                    <a:blip r:embed="rId15"/>
+                    <a:stretch>
+                      <a:fillRect/>
+                    </a:stretch>
+                  </pic:blipFill>
+                  <pic:spPr>
+                    <a:xfrm>
+                      <a:off x="0" y="0"/>
+                      <a:ext cx="5940000" cy="3986654"/>
+                    </a:xfrm>
+                    <a:prstGeom prst="rect"/>
+                  </pic:spPr>
+                </pic:pic>
+              </a:graphicData>
+            </a:graphic>
+          </wp:inline>
+        </w:drawing>
+      </w:r>
+    </w:p>
+    <w:p>
+      <w:pPr>
+        <w:spacing w:before="0" w:after="240"/>
+        <w:jc w:val="center"/>
+      </w:pPr>
+      <w:r>
+        <w:rPr>
+          <w:color w:val="6B7280"/>
+          <w:sz w:val="18"/>
+          <w:rFonts w:ascii="맑은 고딕" w:hAnsi="맑은 고딕" w:eastAsia="맑은 고딕"/>
+        </w:rPr>
+        <w:t>그림 7. 조건(if)과 반복(for)</w:t>
+      </w:r>
+    </w:p>
+    <w:p>
+      <w:pPr>
+        <w:spacing w:before="160" w:after="0" w:line="336" w:lineRule="auto"/>
+        <w:ind w:left="142" w:right="57"/>
+        <w:shd w:val="clear" w:color="auto" w:fill="FDF1E7"/>
+        <w:pBdr>
+          <w:left w:val="single" w:sz="20" w:space="6" w:color="B32020"/>
+        </w:pBdr>
+      </w:pPr>
+      <w:r>
+        <w:rPr>
+          <w:b/>
+          <w:color w:val="B32020"/>
+          <w:sz w:val="21"/>
+          <w:rFonts w:ascii="맑은 고딕" w:hAnsi="맑은 고딕" w:eastAsia="맑은 고딕"/>
+        </w:rPr>
+        <w:t xml:space="preserve">※ </w:t>
+      </w:r>
+      <w:r>
+        <w:rPr>
+          <w:b/>
+          <w:color w:val="B32020"/>
+          <w:sz w:val="21"/>
+          <w:rFonts w:ascii="맑은 고딕" w:hAnsi="맑은 고딕" w:eastAsia="맑은 고딕"/>
+        </w:rPr>
+        <w:t xml:space="preserve">괄호 짝 맞추기  </w:t>
+      </w:r>
+      <w:r>
+        <w:rPr>
+          <w:sz w:val="20"/>
+          <w:rFonts w:ascii="맑은 고딕" w:hAnsi="맑은 고딕" w:eastAsia="맑은 고딕"/>
+        </w:rPr>
+        <w:t>&lt;? if (…) { ?&gt; 로 열었으면 반드시 &lt;? } ?&gt; 로 닫아야 합니다. { 와 } 의 개수가 같아야 합니다.</w:t>
+      </w:r>
+    </w:p>
+    <w:p>
+      <w:pPr>
+        <w:spacing w:before="0" w:after="160" w:line="336" w:lineRule="auto"/>
+        <w:ind w:left="142" w:right="57"/>
+        <w:shd w:val="clear" w:color="auto" w:fill="FDF1E7"/>
+        <w:pBdr>
+          <w:left w:val="single" w:sz="20" w:space="6" w:color="B32020"/>
+        </w:pBdr>
+      </w:pPr>
+      <w:r>
+        <w:rPr>
+          <w:sz w:val="21"/>
+          <w:rFonts w:ascii="맑은 고딕" w:hAnsi="맑은 고딕" w:eastAsia="맑은 고딕"/>
+        </w:rPr>
+        <w:t xml:space="preserve">   </w:t>
+      </w:r>
+      <w:r>
+        <w:rPr>
+          <w:sz w:val="20"/>
+          <w:rFonts w:ascii="맑은 고딕" w:hAnsi="맑은 고딕" w:eastAsia="맑은 고딕"/>
+        </w:rPr>
+        <w:t>닫는 것을 빠뜨리면 발송 때 “SyntaxError” 같은 오류 메일이 옵니다.</w:t>
+      </w:r>
+    </w:p>
+    <w:p>
+      <w:pPr>
+        <w:pStyle w:val="Heading2"/>
+        <w:spacing w:before="280" w:after="100" w:line="312" w:lineRule="auto"/>
+        <w:pBdr>
+          <w:bottom w:val="single" w:sz="4" w:space="3" w:color="C9D2DC"/>
+        </w:pBdr>
+      </w:pPr>
+      <w:r>
+        <w:rPr>
+          <w:b/>
+          <w:color w:val="0F5C8C"/>
+          <w:sz w:val="24"/>
+          <w:rFonts w:ascii="맑은 고딕" w:hAnsi="맑은 고딕" w:eastAsia="맑은 고딕"/>
+        </w:rPr>
+        <w:t>■ 7-6. 실제 파일 ↔ 실제 메일 비교</w:t>
+      </w:r>
+    </w:p>
+    <w:p>
+      <w:r>
+        <w:rPr>
+          <w:sz w:val="21"/>
+          <w:rFonts w:ascii="맑은 고딕" w:hAnsi="맑은 고딕" w:eastAsia="맑은 고딕"/>
+        </w:rPr>
+        <w:t>아래는 이 프로젝트의 진짜 본문 파일(mail_svc_tag.html)과, 발송기가 그것으로 만든 진짜 메일입니다. 왼쪽 코드와 오른쪽 결과를 줄 단위로 맞춰 보세요.</w:t>
+      </w:r>
+    </w:p>
+    <w:p>
+      <w:pPr>
+        <w:spacing w:before="160" w:after="40"/>
+        <w:jc w:val="center"/>
+      </w:pPr>
+      <w:r>
+        <w:drawing>
+          <wp:inline xmlns:a="http://schemas.openxmlformats.org/drawingml/2006/main" xmlns:pic="http://schemas.openxmlformats.org/drawingml/2006/picture">
+            <wp:extent cx="5940000" cy="6600000"/>
+            <wp:docPr id="8" name="Picture 8"/>
+            <wp:cNvGraphicFramePr>
+              <a:graphicFrameLocks noChangeAspect="1"/>
+            </wp:cNvGraphicFramePr>
+            <a:graphic>
+              <a:graphicData uri="http://schemas.openxmlformats.org/drawingml/2006/picture">
+                <pic:pic>
+                  <pic:nvPicPr>
+                    <pic:cNvPr id="0" name="cmp_8_real.png"/>
+                    <pic:cNvPicPr/>
+                  </pic:nvPicPr>
+                  <pic:blipFill>
+                    <a:blip r:embed="rId16"/>
+                    <a:stretch>
+                      <a:fillRect/>
+                    </a:stretch>
+                  </pic:blipFill>
+                  <pic:spPr>
+                    <a:xfrm>
+                      <a:off x="0" y="0"/>
+                      <a:ext cx="5940000" cy="6600000"/>
+                    </a:xfrm>
+                    <a:prstGeom prst="rect"/>
+                  </pic:spPr>
+                </pic:pic>
+              </a:graphicData>
+            </a:graphic>
+          </wp:inline>
+        </w:drawing>
+      </w:r>
+    </w:p>
+    <w:p>
+      <w:pPr>
+        <w:spacing w:before="0" w:after="240"/>
+        <w:jc w:val="center"/>
+      </w:pPr>
+      <w:r>
+        <w:rPr>
+          <w:color w:val="6B7280"/>
+          <w:sz w:val="18"/>
+          <w:rFonts w:ascii="맑은 고딕" w:hAnsi="맑은 고딕" w:eastAsia="맑은 고딕"/>
+        </w:rPr>
+        <w:t>그림 8. 본문 파일 → 실제 발송 메일 (링크 주소는 예시)</w:t>
+      </w:r>
+    </w:p>
+    <w:tbl>
+      <w:tblPr>
+        <w:tblStyle w:val="TableGrid"/>
+        <w:tblW w:type="auto" w:w="0"/>
+        <w:jc w:val="left"/>
+        <w:tblLayout w:type="fixed"/>
+        <w:tblLook w:firstColumn="1" w:firstRow="1" w:lastColumn="0" w:lastRow="0" w:noHBand="0" w:noVBand="1" w:val="04A0"/>
+        <w:tblLayout w:type="fixed"/>
+      </w:tblPr>
+      <w:tblGrid>
+        <w:gridCol w:w="4986"/>
+        <w:gridCol w:w="4986"/>
+      </w:tblGrid>
+      <w:tr>
+        <w:tc>
+          <w:tcPr>
+            <w:tcW w:type="dxa" w:w="3969"/>
+            <w:shd w:val="clear" w:color="auto" w:fill="1E3A5F"/>
+          </w:tcPr>
+          <w:p>
+            <w:pPr>
+              <w:spacing w:before="60" w:after="60" w:line="300" w:lineRule="auto"/>
+            </w:pPr>
+            <w:r/>
+            <w:r>
+              <w:rPr>
+                <w:b/>
+                <w:color w:val="FFFFFF"/>
+                <w:sz w:val="20"/>
+                <w:rFonts w:ascii="맑은 고딕" w:hAnsi="맑은 고딕" w:eastAsia="맑은 고딕"/>
+              </w:rPr>
+              <w:t>오른쪽 메일에서 보이는 것</w:t>
+            </w:r>
+          </w:p>
+        </w:tc>
+        <w:tc>
+          <w:tcPr>
+            <w:tcW w:type="dxa" w:w="5669"/>
+            <w:shd w:val="clear" w:color="auto" w:fill="1E3A5F"/>
+          </w:tcPr>
+          <w:p>
+            <w:pPr>
+              <w:spacing w:before="60" w:after="60" w:line="300" w:lineRule="auto"/>
+            </w:pPr>
+            <w:r/>
+            <w:r>
+              <w:rPr>
+                <w:b/>
+                <w:color w:val="FFFFFF"/>
+                <w:sz w:val="20"/>
+                <w:rFonts w:ascii="맑은 고딕" w:hAnsi="맑은 고딕" w:eastAsia="맑은 고딕"/>
+              </w:rPr>
+              <w:t>어디서 왔나</w:t>
+            </w:r>
+          </w:p>
+        </w:tc>
+      </w:tr>
+      <w:tr>
+        <w:tc>
+          <w:tcPr>
+            <w:tcW w:type="dxa" w:w="3969"/>
+          </w:tcPr>
+          <w:p>
+            <w:pPr>
+              <w:spacing w:before="40" w:after="40" w:line="312" w:lineRule="auto"/>
+            </w:pPr>
+            <w:r/>
+            <w:r>
+              <w:rPr>
+                <w:sz w:val="19"/>
+                <w:rFonts w:ascii="맑은 고딕" w:hAnsi="맑은 고딕" w:eastAsia="맑은 고딕"/>
+              </w:rPr>
+              <w:t>맨 위 “수신: … 참조: …”</w:t>
+            </w:r>
+          </w:p>
+        </w:tc>
+        <w:tc>
+          <w:tcPr>
+            <w:tcW w:type="dxa" w:w="5669"/>
+          </w:tcPr>
+          <w:p>
+            <w:pPr>
+              <w:spacing w:before="40" w:after="40" w:line="312" w:lineRule="auto"/>
+            </w:pPr>
+            <w:r/>
+            <w:r>
+              <w:rPr>
+                <w:sz w:val="19"/>
+                <w:rFonts w:ascii="맑은 고딕" w:hAnsi="맑은 고딕" w:eastAsia="맑은 고딕"/>
+              </w:rPr>
+              <w:t>layout.html + Config.gs 의 displayTo, displayCc</w:t>
+            </w:r>
+          </w:p>
+        </w:tc>
+      </w:tr>
+      <w:tr>
+        <w:tc>
+          <w:tcPr>
+            <w:tcW w:type="dxa" w:w="3969"/>
+            <w:shd w:val="clear" w:color="auto" w:fill="F2F5F8"/>
+          </w:tcPr>
+          <w:p>
+            <w:pPr>
+              <w:spacing w:before="40" w:after="40" w:line="312" w:lineRule="auto"/>
+            </w:pPr>
+            <w:r/>
+            <w:r>
+              <w:rPr>
+                <w:sz w:val="19"/>
+                <w:rFonts w:ascii="맑은 고딕" w:hAnsi="맑은 고딕" w:eastAsia="맑은 고딕"/>
+              </w:rPr>
+              <w:t>“1. 부품수리 SVC Tag 사본 보관” (굵은 글씨)</w:t>
+            </w:r>
+          </w:p>
+        </w:tc>
+        <w:tc>
+          <w:tcPr>
+            <w:tcW w:type="dxa" w:w="5669"/>
+            <w:shd w:val="clear" w:color="auto" w:fill="F2F5F8"/>
+          </w:tcPr>
+          <w:p>
+            <w:pPr>
+              <w:spacing w:before="40" w:after="40" w:line="312" w:lineRule="auto"/>
+            </w:pPr>
+            <w:r/>
+            <w:r>
+              <w:rPr>
+                <w:sz w:val="19"/>
+                <w:rFonts w:ascii="맑은 고딕" w:hAnsi="맑은 고딕" w:eastAsia="맑은 고딕"/>
+              </w:rPr>
+              <w:t>본문의 &lt;strong&gt; … &lt;/strong&gt;</w:t>
+            </w:r>
+          </w:p>
+        </w:tc>
+      </w:tr>
+      <w:tr>
+        <w:tc>
+          <w:tcPr>
+            <w:tcW w:type="dxa" w:w="3969"/>
+          </w:tcPr>
+          <w:p>
+            <w:pPr>
+              <w:spacing w:before="40" w:after="40" w:line="312" w:lineRule="auto"/>
+            </w:pPr>
+            <w:r/>
+            <w:r>
+              <w:rPr>
+                <w:sz w:val="19"/>
+                <w:rFonts w:ascii="맑은 고딕" w:hAnsi="맑은 고딕" w:eastAsia="맑은 고딕"/>
+              </w:rPr>
+              <w:t>가. 나. 다. 가 안쪽으로 들어간 모양</w:t>
+            </w:r>
+          </w:p>
+        </w:tc>
+        <w:tc>
+          <w:tcPr>
+            <w:tcW w:type="dxa" w:w="5669"/>
+          </w:tcPr>
+          <w:p>
+            <w:pPr>
+              <w:spacing w:before="40" w:after="40" w:line="312" w:lineRule="auto"/>
+            </w:pPr>
+            <w:r/>
+            <w:r>
+              <w:rPr>
+                <w:sz w:val="19"/>
+                <w:rFonts w:ascii="맑은 고딕" w:hAnsi="맑은 고딕" w:eastAsia="맑은 고딕"/>
+              </w:rPr>
+              <w:t>본문의 &lt;div style="margin-left: 20px;"&gt;</w:t>
+            </w:r>
+          </w:p>
+        </w:tc>
+      </w:tr>
+      <w:tr>
+        <w:tc>
+          <w:tcPr>
+            <w:tcW w:type="dxa" w:w="3969"/>
+            <w:shd w:val="clear" w:color="auto" w:fill="F2F5F8"/>
+          </w:tcPr>
+          <w:p>
+            <w:pPr>
+              <w:spacing w:before="40" w:after="40" w:line="312" w:lineRule="auto"/>
+            </w:pPr>
+            <w:r/>
+            <w:r>
+              <w:rPr>
+                <w:sz w:val="19"/>
+                <w:rFonts w:ascii="맑은 고딕" w:hAnsi="맑은 고딕" w:eastAsia="맑은 고딕"/>
+              </w:rPr>
+              <w:t>“- 3.2.1.2 …” 가 한 번 더 들어간 모양</w:t>
+            </w:r>
+          </w:p>
+        </w:tc>
+        <w:tc>
+          <w:tcPr>
+            <w:tcW w:type="dxa" w:w="5669"/>
+            <w:shd w:val="clear" w:color="auto" w:fill="F2F5F8"/>
+          </w:tcPr>
+          <w:p>
+            <w:pPr>
+              <w:spacing w:before="40" w:after="40" w:line="312" w:lineRule="auto"/>
+            </w:pPr>
+            <w:r/>
+            <w:r>
+              <w:rPr>
+                <w:sz w:val="19"/>
+                <w:rFonts w:ascii="맑은 고딕" w:hAnsi="맑은 고딕" w:eastAsia="맑은 고딕"/>
+              </w:rPr>
+              <w:t>본문의 안쪽 &lt;div style="margin-left: 20px;"&gt;</w:t>
+            </w:r>
+          </w:p>
+        </w:tc>
+      </w:tr>
+      <w:tr>
+        <w:tc>
+          <w:tcPr>
+            <w:tcW w:type="dxa" w:w="3969"/>
+          </w:tcPr>
+          <w:p>
+            <w:pPr>
+              <w:spacing w:before="40" w:after="40" w:line="312" w:lineRule="auto"/>
+            </w:pPr>
+            <w:r/>
+            <w:r>
+              <w:rPr>
+                <w:sz w:val="19"/>
+                <w:rFonts w:ascii="맑은 고딕" w:hAnsi="맑은 고딕" w:eastAsia="맑은 고딕"/>
+              </w:rPr>
+              <w:t>(ex. 260915)</w:t>
+            </w:r>
+          </w:p>
+        </w:tc>
+        <w:tc>
+          <w:tcPr>
+            <w:tcW w:type="dxa" w:w="5669"/>
+          </w:tcPr>
+          <w:p>
+            <w:pPr>
+              <w:spacing w:before="40" w:after="40" w:line="312" w:lineRule="auto"/>
+            </w:pPr>
+            <w:r/>
+            <w:r>
+              <w:rPr>
+                <w:sz w:val="19"/>
+                <w:rFonts w:ascii="맑은 고딕" w:hAnsi="맑은 고딕" w:eastAsia="맑은 고딕"/>
+              </w:rPr>
+              <w:t>본문의 &lt;?= vars.date ?&gt; (발송일 자동 계산)</w:t>
+            </w:r>
+          </w:p>
+        </w:tc>
+      </w:tr>
+      <w:tr>
+        <w:tc>
+          <w:tcPr>
+            <w:tcW w:type="dxa" w:w="3969"/>
+            <w:shd w:val="clear" w:color="auto" w:fill="F2F5F8"/>
+          </w:tcPr>
+          <w:p>
+            <w:pPr>
+              <w:spacing w:before="40" w:after="40" w:line="312" w:lineRule="auto"/>
+            </w:pPr>
+            <w:r/>
+            <w:r>
+              <w:rPr>
+                <w:sz w:val="19"/>
+                <w:rFonts w:ascii="맑은 고딕" w:hAnsi="맑은 고딕" w:eastAsia="맑은 고딕"/>
+              </w:rPr>
+              <w:t>“링크” 파란 글씨</w:t>
+            </w:r>
+          </w:p>
+        </w:tc>
+        <w:tc>
+          <w:tcPr>
+            <w:tcW w:type="dxa" w:w="5669"/>
+            <w:shd w:val="clear" w:color="auto" w:fill="F2F5F8"/>
+          </w:tcPr>
+          <w:p>
+            <w:pPr>
+              <w:spacing w:before="40" w:after="40" w:line="312" w:lineRule="auto"/>
+            </w:pPr>
+            <w:r/>
+            <w:r>
+              <w:rPr>
+                <w:sz w:val="19"/>
+                <w:rFonts w:ascii="맑은 고딕" w:hAnsi="맑은 고딕" w:eastAsia="맑은 고딕"/>
+              </w:rPr>
+              <w:t>본문의 &lt;?!= linkHtml(links.attach1, '링크') ?&gt;</w:t>
+            </w:r>
+          </w:p>
+        </w:tc>
+      </w:tr>
+      <w:tr>
+        <w:tc>
+          <w:tcPr>
+            <w:tcW w:type="dxa" w:w="3969"/>
+          </w:tcPr>
+          <w:p>
+            <w:pPr>
+              <w:spacing w:before="40" w:after="40" w:line="312" w:lineRule="auto"/>
+            </w:pPr>
+            <w:r/>
+            <w:r>
+              <w:rPr>
+                <w:sz w:val="19"/>
+                <w:rFonts w:ascii="맑은 고딕" w:hAnsi="맑은 고딕" w:eastAsia="맑은 고딕"/>
+              </w:rPr>
+              <w:t>맨 아래 “임태현 드림 … Office”</w:t>
+            </w:r>
+          </w:p>
+        </w:tc>
+        <w:tc>
+          <w:tcPr>
+            <w:tcW w:type="dxa" w:w="5669"/>
+          </w:tcPr>
+          <w:p>
+            <w:pPr>
+              <w:spacing w:before="40" w:after="40" w:line="312" w:lineRule="auto"/>
+            </w:pPr>
+            <w:r/>
+            <w:r>
+              <w:rPr>
+                <w:sz w:val="19"/>
+                <w:rFonts w:ascii="맑은 고딕" w:hAnsi="맑은 고딕" w:eastAsia="맑은 고딕"/>
+              </w:rPr>
+              <w:t>signature.html + Config.gs 의 SENDER</w:t>
+            </w:r>
+          </w:p>
+        </w:tc>
+      </w:tr>
+      <w:tr>
+        <w:tc>
+          <w:tcPr>
+            <w:tcW w:type="dxa" w:w="3969"/>
+            <w:shd w:val="clear" w:color="auto" w:fill="F2F5F8"/>
+          </w:tcPr>
+          <w:p>
+            <w:pPr>
+              <w:spacing w:before="40" w:after="40" w:line="312" w:lineRule="auto"/>
+            </w:pPr>
+            <w:r/>
+            <w:r>
+              <w:rPr>
+                <w:sz w:val="19"/>
+                <w:rFonts w:ascii="맑은 고딕" w:hAnsi="맑은 고딕" w:eastAsia="맑은 고딕"/>
+              </w:rPr>
+              <w:t>글꼴 · 글자 크기 · 줄 간격</w:t>
+            </w:r>
+          </w:p>
+        </w:tc>
+        <w:tc>
+          <w:tcPr>
+            <w:tcW w:type="dxa" w:w="5669"/>
+            <w:shd w:val="clear" w:color="auto" w:fill="F2F5F8"/>
+          </w:tcPr>
+          <w:p>
+            <w:pPr>
+              <w:spacing w:before="40" w:after="40" w:line="312" w:lineRule="auto"/>
+            </w:pPr>
+            <w:r/>
+            <w:r>
+              <w:rPr>
+                <w:sz w:val="19"/>
+                <w:rFonts w:ascii="맑은 고딕" w:hAnsi="맑은 고딕" w:eastAsia="맑은 고딕"/>
+              </w:rPr>
+              <w:t>layout.html 이 전체에 한 번에 적용</w:t>
+            </w:r>
+          </w:p>
+        </w:tc>
+      </w:tr>
+    </w:tbl>
+    <w:p>
+      <w:pPr>
+        <w:spacing w:before="0" w:after="120" w:line="240" w:lineRule="auto"/>
+      </w:pPr>
+      <w:r>
+        <w:rPr>
+          <w:sz w:val="2"/>
+          <w:rFonts w:ascii="맑은 고딕" w:hAnsi="맑은 고딕" w:eastAsia="맑은 고딕"/>
+        </w:rPr>
+      </w:r>
+    </w:p>
+    <w:p>
+      <w:pPr>
+        <w:spacing w:before="160" w:after="0" w:line="336" w:lineRule="auto"/>
+        <w:ind w:left="142" w:right="57"/>
+        <w:shd w:val="clear" w:color="auto" w:fill="EAF6EE"/>
+        <w:pBdr>
+          <w:left w:val="single" w:sz="20" w:space="6" w:color="15803D"/>
+        </w:pBdr>
+      </w:pPr>
+      <w:r>
+        <w:rPr>
+          <w:b/>
+          <w:color w:val="15803D"/>
+          <w:sz w:val="21"/>
+          <w:rFonts w:ascii="맑은 고딕" w:hAnsi="맑은 고딕" w:eastAsia="맑은 고딕"/>
+        </w:rPr>
+        <w:t xml:space="preserve">● </w:t>
+      </w:r>
+      <w:r>
+        <w:rPr>
+          <w:b/>
+          <w:color w:val="15803D"/>
+          <w:sz w:val="21"/>
+          <w:rFonts w:ascii="맑은 고딕" w:hAnsi="맑은 고딕" w:eastAsia="맑은 고딕"/>
+        </w:rPr>
+        <w:t xml:space="preserve">역할 나누기  </w:t>
+      </w:r>
+      <w:r>
+        <w:rPr>
+          <w:sz w:val="20"/>
+          <w:rFonts w:ascii="맑은 고딕" w:hAnsi="맑은 고딕" w:eastAsia="맑은 고딕"/>
+        </w:rPr>
+        <w:t>본문 파일에는 “본문”만 씁니다. 글꼴, 수신/참조 표시, 서명은 layout.html 과 signature.html 이 알아서 붙여 줍니다.</w:t>
+      </w:r>
+    </w:p>
+    <w:p>
+      <w:pPr>
+        <w:spacing w:before="0" w:after="160" w:line="336" w:lineRule="auto"/>
+        <w:ind w:left="142" w:right="57"/>
+        <w:shd w:val="clear" w:color="auto" w:fill="EAF6EE"/>
+        <w:pBdr>
+          <w:left w:val="single" w:sz="20" w:space="6" w:color="15803D"/>
+        </w:pBdr>
+      </w:pPr>
+      <w:r>
+        <w:rPr>
+          <w:sz w:val="21"/>
+          <w:rFonts w:ascii="맑은 고딕" w:hAnsi="맑은 고딕" w:eastAsia="맑은 고딕"/>
+        </w:rPr>
+        <w:t xml:space="preserve">   </w:t>
+      </w:r>
+      <w:r>
+        <w:rPr>
+          <w:sz w:val="20"/>
+          <w:rFonts w:ascii="맑은 고딕" w:hAnsi="맑은 고딕" w:eastAsia="맑은 고딕"/>
+        </w:rPr>
+        <w:t>그래서 메일 종류가 늘어도 서명을 복사해 붙일 필요가 없습니다.</w:t>
+      </w:r>
+    </w:p>
+    <w:p>
+      <w:pPr>
+        <w:pStyle w:val="Heading2"/>
+        <w:spacing w:before="280" w:after="100" w:line="312" w:lineRule="auto"/>
+        <w:pBdr>
+          <w:bottom w:val="single" w:sz="4" w:space="3" w:color="C9D2DC"/>
+        </w:pBdr>
+      </w:pPr>
+      <w:r>
+        <w:rPr>
+          <w:b/>
+          <w:color w:val="0F5C8C"/>
+          <w:sz w:val="24"/>
+          <w:rFonts w:ascii="맑은 고딕" w:hAnsi="맑은 고딕" w:eastAsia="맑은 고딕"/>
+        </w:rPr>
+        <w:t>■ 7-7. 지켜야 할 규칙 (이유와 함께)</w:t>
+      </w:r>
+    </w:p>
+    <w:tbl>
+      <w:tblPr>
+        <w:tblStyle w:val="TableGrid"/>
+        <w:tblW w:type="auto" w:w="0"/>
+        <w:jc w:val="left"/>
+        <w:tblLayout w:type="fixed"/>
+        <w:tblLook w:firstColumn="1" w:firstRow="1" w:lastColumn="0" w:lastRow="0" w:noHBand="0" w:noVBand="1" w:val="04A0"/>
+        <w:tblLayout w:type="fixed"/>
+      </w:tblPr>
+      <w:tblGrid>
+        <w:gridCol w:w="4986"/>
+        <w:gridCol w:w="4986"/>
+      </w:tblGrid>
+      <w:tr>
+        <w:tc>
+          <w:tcPr>
+            <w:tcW w:type="dxa" w:w="3402"/>
+            <w:shd w:val="clear" w:color="auto" w:fill="1E3A5F"/>
+          </w:tcPr>
+          <w:p>
+            <w:pPr>
+              <w:spacing w:before="60" w:after="60" w:line="300" w:lineRule="auto"/>
+            </w:pPr>
+            <w:r/>
+            <w:r>
+              <w:rPr>
+                <w:b/>
+                <w:color w:val="FFFFFF"/>
+                <w:sz w:val="20"/>
+                <w:rFonts w:ascii="맑은 고딕" w:hAnsi="맑은 고딕" w:eastAsia="맑은 고딕"/>
+              </w:rPr>
+              <w:t>규칙</w:t>
+            </w:r>
+          </w:p>
+        </w:tc>
+        <w:tc>
+          <w:tcPr>
+            <w:tcW w:type="dxa" w:w="6236"/>
+            <w:shd w:val="clear" w:color="auto" w:fill="1E3A5F"/>
+          </w:tcPr>
+          <w:p>
+            <w:pPr>
+              <w:spacing w:before="60" w:after="60" w:line="300" w:lineRule="auto"/>
+            </w:pPr>
+            <w:r/>
+            <w:r>
+              <w:rPr>
+                <w:b/>
+                <w:color w:val="FFFFFF"/>
+                <w:sz w:val="20"/>
+                <w:rFonts w:ascii="맑은 고딕" w:hAnsi="맑은 고딕" w:eastAsia="맑은 고딕"/>
+              </w:rPr>
+              <w:t>이유</w:t>
+            </w:r>
+          </w:p>
+        </w:tc>
+      </w:tr>
+      <w:tr>
+        <w:tc>
+          <w:tcPr>
+            <w:tcW w:type="dxa" w:w="3402"/>
+          </w:tcPr>
+          <w:p>
+            <w:pPr>
+              <w:spacing w:before="40" w:after="40" w:line="312" w:lineRule="auto"/>
+            </w:pPr>
+            <w:r/>
+            <w:r>
+              <w:rPr>
+                <w:sz w:val="19"/>
+                <w:rFonts w:ascii="맑은 고딕" w:hAnsi="맑은 고딕" w:eastAsia="맑은 고딕"/>
+              </w:rPr>
+              <w:t>스타일은 style="…" 로 태그에 직접(인라인)</w:t>
+            </w:r>
+          </w:p>
+        </w:tc>
+        <w:tc>
+          <w:tcPr>
+            <w:tcW w:type="dxa" w:w="6236"/>
+          </w:tcPr>
+          <w:p>
+            <w:pPr>
+              <w:spacing w:before="40" w:after="40" w:line="312" w:lineRule="auto"/>
+            </w:pPr>
+            <w:r/>
+            <w:r>
+              <w:rPr>
+                <w:sz w:val="19"/>
+                <w:rFonts w:ascii="맑은 고딕" w:hAnsi="맑은 고딕" w:eastAsia="맑은 고딕"/>
+              </w:rPr>
+              <w:t>Outlook 등 사내 메일 프로그램은 &lt;style&gt; 블록을 무시하는 경우가 많다</w:t>
+            </w:r>
+          </w:p>
+        </w:tc>
+      </w:tr>
+      <w:tr>
+        <w:tc>
+          <w:tcPr>
+            <w:tcW w:type="dxa" w:w="3402"/>
+            <w:shd w:val="clear" w:color="auto" w:fill="F2F5F8"/>
+          </w:tcPr>
+          <w:p>
+            <w:pPr>
+              <w:spacing w:before="40" w:after="40" w:line="312" w:lineRule="auto"/>
+            </w:pPr>
+            <w:r/>
+            <w:r>
+              <w:rPr>
+                <w:sz w:val="19"/>
+                <w:rFonts w:ascii="맑은 고딕" w:hAnsi="맑은 고딕" w:eastAsia="맑은 고딕"/>
+              </w:rPr>
+              <w:t>주석은 &lt;? /* … */ ?&gt;</w:t>
+            </w:r>
+          </w:p>
+        </w:tc>
+        <w:tc>
+          <w:tcPr>
+            <w:tcW w:type="dxa" w:w="6236"/>
+            <w:shd w:val="clear" w:color="auto" w:fill="F2F5F8"/>
+          </w:tcPr>
+          <w:p>
+            <w:pPr>
+              <w:spacing w:before="40" w:after="40" w:line="312" w:lineRule="auto"/>
+            </w:pPr>
+            <w:r/>
+            <w:r>
+              <w:rPr>
+                <w:sz w:val="19"/>
+                <w:rFonts w:ascii="맑은 고딕" w:hAnsi="맑은 고딕" w:eastAsia="맑은 고딕"/>
+              </w:rPr>
+              <w:t>&lt;!-- --&gt; 주석은 메일 원본에 그대로 실려 나간다. 그 안에 &lt;?= ?&gt; 가 있으면 실행되어 오류도 난다</w:t>
+            </w:r>
+          </w:p>
+        </w:tc>
+      </w:tr>
+      <w:tr>
+        <w:tc>
+          <w:tcPr>
+            <w:tcW w:type="dxa" w:w="3402"/>
+          </w:tcPr>
+          <w:p>
+            <w:pPr>
+              <w:spacing w:before="40" w:after="40" w:line="312" w:lineRule="auto"/>
+            </w:pPr>
+            <w:r/>
+            <w:r>
+              <w:rPr>
+                <w:sz w:val="19"/>
+                <w:rFonts w:ascii="맑은 고딕" w:hAnsi="맑은 고딕" w:eastAsia="맑은 고딕"/>
+              </w:rPr>
+              <w:t>꺾쇠는 &amp;lt; &amp;gt; 로</w:t>
+            </w:r>
+          </w:p>
+        </w:tc>
+        <w:tc>
+          <w:tcPr>
+            <w:tcW w:type="dxa" w:w="6236"/>
+          </w:tcPr>
+          <w:p>
+            <w:pPr>
+              <w:spacing w:before="40" w:after="40" w:line="312" w:lineRule="auto"/>
+            </w:pPr>
+            <w:r/>
+            <w:r>
+              <w:rPr>
+                <w:sz w:val="19"/>
+                <w:rFonts w:ascii="맑은 고딕" w:hAnsi="맑은 고딕" w:eastAsia="맑은 고딕"/>
+              </w:rPr>
+              <w:t>글자 &lt; 바로 뒤에 글자가 오면 태그로 오인되어 그 글자가 사라진다 (그림 9)</w:t>
+            </w:r>
+          </w:p>
+        </w:tc>
+      </w:tr>
+      <w:tr>
+        <w:tc>
+          <w:tcPr>
+            <w:tcW w:type="dxa" w:w="3402"/>
+            <w:shd w:val="clear" w:color="auto" w:fill="F2F5F8"/>
+          </w:tcPr>
+          <w:p>
+            <w:pPr>
+              <w:spacing w:before="40" w:after="40" w:line="312" w:lineRule="auto"/>
+            </w:pPr>
+            <w:r/>
+            <w:r>
+              <w:rPr>
+                <w:sz w:val="19"/>
+                <w:rFonts w:ascii="맑은 고딕" w:hAnsi="맑은 고딕" w:eastAsia="맑은 고딕"/>
+              </w:rPr>
+              <w:t>글꼴·서명은 본문에 쓰지 않기</w:t>
+            </w:r>
+          </w:p>
+        </w:tc>
+        <w:tc>
+          <w:tcPr>
+            <w:tcW w:type="dxa" w:w="6236"/>
+            <w:shd w:val="clear" w:color="auto" w:fill="F2F5F8"/>
+          </w:tcPr>
+          <w:p>
+            <w:pPr>
+              <w:spacing w:before="40" w:after="40" w:line="312" w:lineRule="auto"/>
+            </w:pPr>
+            <w:r/>
+            <w:r>
+              <w:rPr>
+                <w:sz w:val="19"/>
+                <w:rFonts w:ascii="맑은 고딕" w:hAnsi="맑은 고딕" w:eastAsia="맑은 고딕"/>
+              </w:rPr>
+              <w:t>layout.html / signature.html 이 자동으로 붙여 준다</w:t>
+            </w:r>
+          </w:p>
+        </w:tc>
+      </w:tr>
+      <w:tr>
+        <w:tc>
+          <w:tcPr>
+            <w:tcW w:type="dxa" w:w="3402"/>
+          </w:tcPr>
+          <w:p>
+            <w:pPr>
+              <w:spacing w:before="40" w:after="40" w:line="312" w:lineRule="auto"/>
+            </w:pPr>
+            <w:r/>
+            <w:r>
+              <w:rPr>
+                <w:sz w:val="19"/>
+                <w:rFonts w:ascii="맑은 고딕" w:hAnsi="맑은 고딕" w:eastAsia="맑은 고딕"/>
+              </w:rPr>
+              <w:t>링크는 항상 linkHtml 로</w:t>
+            </w:r>
+          </w:p>
+        </w:tc>
+        <w:tc>
+          <w:tcPr>
+            <w:tcW w:type="dxa" w:w="6236"/>
+          </w:tcPr>
+          <w:p>
+            <w:pPr>
+              <w:spacing w:before="40" w:after="40" w:line="312" w:lineRule="auto"/>
+            </w:pPr>
+            <w:r/>
+            <w:r>
+              <w:rPr>
+                <w:sz w:val="19"/>
+                <w:rFonts w:ascii="맑은 고딕" w:hAnsi="맑은 고딕" w:eastAsia="맑은 고딕"/>
+              </w:rPr>
+              <w:t>색이 통일되고, 빈 링크가 자동 검출된다</w:t>
+            </w:r>
+          </w:p>
+        </w:tc>
+      </w:tr>
+      <w:tr>
+        <w:tc>
+          <w:tcPr>
+            <w:tcW w:type="dxa" w:w="3402"/>
+            <w:shd w:val="clear" w:color="auto" w:fill="F2F5F8"/>
+          </w:tcPr>
+          <w:p>
+            <w:pPr>
+              <w:spacing w:before="40" w:after="40" w:line="312" w:lineRule="auto"/>
+            </w:pPr>
+            <w:r/>
+            <w:r>
+              <w:rPr>
+                <w:sz w:val="19"/>
+                <w:rFonts w:ascii="맑은 고딕" w:hAnsi="맑은 고딕" w:eastAsia="맑은 고딕"/>
+              </w:rPr>
+              <w:t>새 HTML 파일의 기본 내용은 지우기</w:t>
+            </w:r>
+          </w:p>
+        </w:tc>
+        <w:tc>
+          <w:tcPr>
+            <w:tcW w:type="dxa" w:w="6236"/>
+            <w:shd w:val="clear" w:color="auto" w:fill="F2F5F8"/>
+          </w:tcPr>
+          <w:p>
+            <w:pPr>
+              <w:spacing w:before="40" w:after="40" w:line="312" w:lineRule="auto"/>
+            </w:pPr>
+            <w:r/>
+            <w:r>
+              <w:rPr>
+                <w:sz w:val="19"/>
+                <w:rFonts w:ascii="맑은 고딕" w:hAnsi="맑은 고딕" w:eastAsia="맑은 고딕"/>
+              </w:rPr>
+              <w:t>Apps Script 가 만들어 주는 &lt;!DOCTYPE html&gt; … 이 남아 있으면 메일에 섞여 들어간다</w:t>
+            </w:r>
+          </w:p>
+        </w:tc>
+      </w:tr>
+    </w:tbl>
+    <w:p>
+      <w:pPr>
+        <w:spacing w:before="0" w:after="120" w:line="240" w:lineRule="auto"/>
+      </w:pPr>
+      <w:r>
+        <w:rPr>
+          <w:sz w:val="2"/>
+          <w:rFonts w:ascii="맑은 고딕" w:hAnsi="맑은 고딕" w:eastAsia="맑은 고딕"/>
+        </w:rPr>
+      </w:r>
+    </w:p>
+    <w:p>
+      <w:pPr>
+        <w:pStyle w:val="Heading2"/>
+        <w:spacing w:before="280" w:after="100" w:line="312" w:lineRule="auto"/>
+        <w:pBdr>
+          <w:bottom w:val="single" w:sz="4" w:space="3" w:color="C9D2DC"/>
+        </w:pBdr>
+      </w:pPr>
+      <w:r>
+        <w:rPr>
+          <w:b/>
+          <w:color w:val="0F5C8C"/>
+          <w:sz w:val="24"/>
+          <w:rFonts w:ascii="맑은 고딕" w:hAnsi="맑은 고딕" w:eastAsia="맑은 고딕"/>
+        </w:rPr>
+        <w:t>■ 7-8. 자주 하는 실수 5가지</w:t>
+      </w:r>
+    </w:p>
+    <w:p>
+      <w:pPr>
+        <w:spacing w:before="160" w:after="40"/>
+        <w:jc w:val="center"/>
+      </w:pPr>
+      <w:r>
+        <w:drawing>
+          <wp:inline xmlns:a="http://schemas.openxmlformats.org/drawingml/2006/main" xmlns:pic="http://schemas.openxmlformats.org/drawingml/2006/picture">
+            <wp:extent cx="5940000" cy="5384077"/>
+            <wp:docPr id="9" name="Picture 9"/>
+            <wp:cNvGraphicFramePr>
+              <a:graphicFrameLocks noChangeAspect="1"/>
+            </wp:cNvGraphicFramePr>
+            <a:graphic>
+              <a:graphicData uri="http://schemas.openxmlformats.org/drawingml/2006/picture">
+                <pic:pic>
+                  <pic:nvPicPr>
+                    <pic:cNvPr id="0" name="cmp_7_mistakes.png"/>
+                    <pic:cNvPicPr/>
+                  </pic:nvPicPr>
+                  <pic:blipFill>
+                    <a:blip r:embed="rId17"/>
+                    <a:stretch>
+                      <a:fillRect/>
+                    </a:stretch>
+                  </pic:blipFill>
+                  <pic:spPr>
+                    <a:xfrm>
+                      <a:off x="0" y="0"/>
+                      <a:ext cx="5940000" cy="5384077"/>
+                    </a:xfrm>
+                    <a:prstGeom prst="rect"/>
+                  </pic:spPr>
+                </pic:pic>
+              </a:graphicData>
+            </a:graphic>
+          </wp:inline>
+        </w:drawing>
+      </w:r>
+    </w:p>
+    <w:p>
+      <w:pPr>
+        <w:spacing w:before="0" w:after="240"/>
+        <w:jc w:val="center"/>
+      </w:pPr>
+      <w:r>
+        <w:rPr>
+          <w:color w:val="6B7280"/>
+          <w:sz w:val="18"/>
+          <w:rFonts w:ascii="맑은 고딕" w:hAnsi="맑은 고딕" w:eastAsia="맑은 고딕"/>
+        </w:rPr>
+        <w:t>그림 9. 실수와 정답 비교: &lt;?= ?&gt; / &lt;?!= ?&gt;, 꺾쇠 처리</w:t>
       </w:r>
     </w:p>
     <w:tbl>
@@ -11250,7 +14445,7 @@
       <w:tr>
         <w:tc>
           <w:tcPr>
-            <w:tcW w:type="dxa" w:w="1984"/>
+            <w:tcW w:type="dxa" w:w="2948"/>
             <w:shd w:val="clear" w:color="auto" w:fill="1E3A5F"/>
           </w:tcPr>
           <w:p>
@@ -11265,7 +14460,7 @@
                 <w:sz w:val="20"/>
                 <w:rFonts w:ascii="맑은 고딕" w:hAnsi="맑은 고딕" w:eastAsia="맑은 고딕"/>
               </w:rPr>
-              <w:t>값</w:t>
+              <w:t>이렇게 보이면</w:t>
             </w:r>
           </w:p>
         </w:tc>
@@ -11286,13 +14481,13 @@
                 <w:sz w:val="20"/>
                 <w:rFonts w:ascii="맑은 고딕" w:hAnsi="맑은 고딕" w:eastAsia="맑은 고딕"/>
               </w:rPr>
-              <w:t>내용</w:t>
-            </w:r>
-          </w:p>
-        </w:tc>
-        <w:tc>
-          <w:tcPr>
-            <w:tcW w:type="dxa" w:w="4252"/>
+              <w:t>원인</w:t>
+            </w:r>
+          </w:p>
+        </w:tc>
+        <w:tc>
+          <w:tcPr>
+            <w:tcW w:type="dxa" w:w="3288"/>
             <w:shd w:val="clear" w:color="auto" w:fill="1E3A5F"/>
           </w:tcPr>
           <w:p>
@@ -11307,7 +14502,7 @@
                 <w:sz w:val="20"/>
                 <w:rFonts w:ascii="맑은 고딕" w:hAnsi="맑은 고딕" w:eastAsia="맑은 고딕"/>
               </w:rPr>
-              <w:t>예</w:t>
+              <w:t>고치는 법</w:t>
             </w:r>
           </w:p>
         </w:tc>
@@ -11315,25 +14510,7 @@
       <w:tr>
         <w:tc>
           <w:tcPr>
-            <w:tcW w:type="dxa" w:w="1984"/>
-          </w:tcPr>
-          <w:p>
-            <w:pPr>
-              <w:spacing w:before="40" w:after="40" w:line="312" w:lineRule="auto"/>
-            </w:pPr>
-            <w:r/>
-            <w:r>
-              <w:rPr>
-                <w:sz w:val="19"/>
-                <w:rFonts w:ascii="Consolas" w:hAnsi="Consolas" w:eastAsia="Consolas"/>
-              </w:rPr>
-              <w:t>vars.date</w:t>
-            </w:r>
-          </w:p>
-        </w:tc>
-        <w:tc>
-          <w:tcPr>
-            <w:tcW w:type="dxa" w:w="3402"/>
+            <w:tcW w:type="dxa" w:w="2948"/>
           </w:tcPr>
           <w:p>
             <w:pPr>
@@ -11345,13 +14522,13 @@
                 <w:sz w:val="19"/>
                 <w:rFonts w:ascii="맑은 고딕" w:hAnsi="맑은 고딕" w:eastAsia="맑은 고딕"/>
               </w:rPr>
-              <w:t>발송일 YYMMDD</w:t>
-            </w:r>
-          </w:p>
-        </w:tc>
-        <w:tc>
-          <w:tcPr>
-            <w:tcW w:type="dxa" w:w="4252"/>
+              <w:t>링크가 &lt;a href=…&gt; 글자 그대로 보인다</w:t>
+            </w:r>
+          </w:p>
+        </w:tc>
+        <w:tc>
+          <w:tcPr>
+            <w:tcW w:type="dxa" w:w="3402"/>
           </w:tcPr>
           <w:p>
             <w:pPr>
@@ -11361,9 +14538,27 @@
             <w:r>
               <w:rPr>
                 <w:sz w:val="19"/>
-                <w:rFonts w:ascii="Consolas" w:hAnsi="Consolas" w:eastAsia="Consolas"/>
-              </w:rPr>
-              <w:t>260915</w:t>
+                <w:rFonts w:ascii="맑은 고딕" w:hAnsi="맑은 고딕" w:eastAsia="맑은 고딕"/>
+              </w:rPr>
+              <w:t>&lt;?= ?&gt; 로 링크를 출력</w:t>
+            </w:r>
+          </w:p>
+        </w:tc>
+        <w:tc>
+          <w:tcPr>
+            <w:tcW w:type="dxa" w:w="3288"/>
+          </w:tcPr>
+          <w:p>
+            <w:pPr>
+              <w:spacing w:before="40" w:after="40" w:line="312" w:lineRule="auto"/>
+            </w:pPr>
+            <w:r/>
+            <w:r>
+              <w:rPr>
+                <w:sz w:val="19"/>
+                <w:rFonts w:ascii="맑은 고딕" w:hAnsi="맑은 고딕" w:eastAsia="맑은 고딕"/>
+              </w:rPr>
+              <w:t>&lt;?!= linkHtml(…) ?&gt; 로 바꾼다</w:t>
             </w:r>
           </w:p>
         </w:tc>
@@ -11371,7 +14566,7 @@
       <w:tr>
         <w:tc>
           <w:tcPr>
-            <w:tcW w:type="dxa" w:w="1984"/>
+            <w:tcW w:type="dxa" w:w="2948"/>
             <w:shd w:val="clear" w:color="auto" w:fill="F2F5F8"/>
           </w:tcPr>
           <w:p>
@@ -11382,9 +14577,9 @@
             <w:r>
               <w:rPr>
                 <w:sz w:val="19"/>
-                <w:rFonts w:ascii="Consolas" w:hAnsi="Consolas" w:eastAsia="Consolas"/>
-              </w:rPr>
-              <w:t>vars.today</w:t>
+                <w:rFonts w:ascii="맑은 고딕" w:hAnsi="맑은 고딕" w:eastAsia="맑은 고딕"/>
+              </w:rPr>
+              <w:t>줄이 안 바뀌고 한 줄로 이어진다</w:t>
             </w:r>
           </w:p>
         </w:tc>
@@ -11403,13 +14598,13 @@
                 <w:sz w:val="19"/>
                 <w:rFonts w:ascii="맑은 고딕" w:hAnsi="맑은 고딕" w:eastAsia="맑은 고딕"/>
               </w:rPr>
-              <w:t>발송일 YYYY-MM-DD</w:t>
-            </w:r>
-          </w:p>
-        </w:tc>
-        <w:tc>
-          <w:tcPr>
-            <w:tcW w:type="dxa" w:w="4252"/>
+              <w:t>엔터만 치고 &lt;br&gt; 을 안 씀</w:t>
+            </w:r>
+          </w:p>
+        </w:tc>
+        <w:tc>
+          <w:tcPr>
+            <w:tcW w:type="dxa" w:w="3288"/>
             <w:shd w:val="clear" w:color="auto" w:fill="F2F5F8"/>
           </w:tcPr>
           <w:p>
@@ -11420,9 +14615,9 @@
             <w:r>
               <w:rPr>
                 <w:sz w:val="19"/>
-                <w:rFonts w:ascii="Consolas" w:hAnsi="Consolas" w:eastAsia="Consolas"/>
-              </w:rPr>
-              <w:t>2026-09-15</w:t>
+                <w:rFonts w:ascii="맑은 고딕" w:hAnsi="맑은 고딕" w:eastAsia="맑은 고딕"/>
+              </w:rPr>
+              <w:t>줄 끝에 &lt;br&gt; 을 붙인다</w:t>
             </w:r>
           </w:p>
         </w:tc>
@@ -11430,25 +14625,7 @@
       <w:tr>
         <w:tc>
           <w:tcPr>
-            <w:tcW w:type="dxa" w:w="1984"/>
-          </w:tcPr>
-          <w:p>
-            <w:pPr>
-              <w:spacing w:before="40" w:after="40" w:line="312" w:lineRule="auto"/>
-            </w:pPr>
-            <w:r/>
-            <w:r>
-              <w:rPr>
-                <w:sz w:val="19"/>
-                <w:rFonts w:ascii="Consolas" w:hAnsi="Consolas" w:eastAsia="Consolas"/>
-              </w:rPr>
-              <w:t>links.이름</w:t>
-            </w:r>
-          </w:p>
-        </w:tc>
-        <w:tc>
-          <w:tcPr>
-            <w:tcW w:type="dxa" w:w="3402"/>
+            <w:tcW w:type="dxa" w:w="2948"/>
           </w:tcPr>
           <w:p>
             <w:pPr>
@@ -11460,13 +14637,13 @@
                 <w:sz w:val="19"/>
                 <w:rFonts w:ascii="맑은 고딕" w:hAnsi="맑은 고딕" w:eastAsia="맑은 고딕"/>
               </w:rPr>
-              <w:t>Config.gs links 의 주소</w:t>
-            </w:r>
-          </w:p>
-        </w:tc>
-        <w:tc>
-          <w:tcPr>
-            <w:tcW w:type="dxa" w:w="4252"/>
+              <w:t>글자 일부가 사라진다</w:t>
+            </w:r>
+          </w:p>
+        </w:tc>
+        <w:tc>
+          <w:tcPr>
+            <w:tcW w:type="dxa" w:w="3402"/>
           </w:tcPr>
           <w:p>
             <w:pPr>
@@ -11476,9 +14653,27 @@
             <w:r>
               <w:rPr>
                 <w:sz w:val="19"/>
-                <w:rFonts w:ascii="Consolas" w:hAnsi="Consolas" w:eastAsia="Consolas"/>
-              </w:rPr>
-              <w:t>linkHtml(links.attach1, '링크')</w:t>
+                <w:rFonts w:ascii="맑은 고딕" w:hAnsi="맑은 고딕" w:eastAsia="맑은 고딕"/>
+              </w:rPr>
+              <w:t>&lt; 를 그대로 씀 (예: &lt;A열&gt;)</w:t>
+            </w:r>
+          </w:p>
+        </w:tc>
+        <w:tc>
+          <w:tcPr>
+            <w:tcW w:type="dxa" w:w="3288"/>
+          </w:tcPr>
+          <w:p>
+            <w:pPr>
+              <w:spacing w:before="40" w:after="40" w:line="312" w:lineRule="auto"/>
+            </w:pPr>
+            <w:r/>
+            <w:r>
+              <w:rPr>
+                <w:sz w:val="19"/>
+                <w:rFonts w:ascii="맑은 고딕" w:hAnsi="맑은 고딕" w:eastAsia="맑은 고딕"/>
+              </w:rPr>
+              <w:t>&amp;lt;A열&amp;gt; 로 쓴다</w:t>
             </w:r>
           </w:p>
         </w:tc>
@@ -11486,7 +14681,7 @@
       <w:tr>
         <w:tc>
           <w:tcPr>
-            <w:tcW w:type="dxa" w:w="1984"/>
+            <w:tcW w:type="dxa" w:w="2948"/>
             <w:shd w:val="clear" w:color="auto" w:fill="F2F5F8"/>
           </w:tcPr>
           <w:p>
@@ -11497,9 +14692,9 @@
             <w:r>
               <w:rPr>
                 <w:sz w:val="19"/>
-                <w:rFonts w:ascii="Consolas" w:hAnsi="Consolas" w:eastAsia="Consolas"/>
-              </w:rPr>
-              <w:t>job.항목</w:t>
+                <w:rFonts w:ascii="맑은 고딕" w:hAnsi="맑은 고딕" w:eastAsia="맑은 고딕"/>
+              </w:rPr>
+              <w:t>뒤쪽 글이 전부 굵게/기울게 나온다</w:t>
             </w:r>
           </w:p>
         </w:tc>
@@ -11518,13 +14713,13 @@
                 <w:sz w:val="19"/>
                 <w:rFonts w:ascii="맑은 고딕" w:hAnsi="맑은 고딕" w:eastAsia="맑은 고딕"/>
               </w:rPr>
-              <w:t>Config.gs 묶음의 아무 항목</w:t>
-            </w:r>
-          </w:p>
-        </w:tc>
-        <w:tc>
-          <w:tcPr>
-            <w:tcW w:type="dxa" w:w="4252"/>
+              <w:t>&lt;/strong&gt; 같은 닫는 태그 누락</w:t>
+            </w:r>
+          </w:p>
+        </w:tc>
+        <w:tc>
+          <w:tcPr>
+            <w:tcW w:type="dxa" w:w="3288"/>
             <w:shd w:val="clear" w:color="auto" w:fill="F2F5F8"/>
           </w:tcPr>
           <w:p>
@@ -11535,9 +14730,9 @@
             <w:r>
               <w:rPr>
                 <w:sz w:val="19"/>
-                <w:rFonts w:ascii="Consolas" w:hAnsi="Consolas" w:eastAsia="Consolas"/>
-              </w:rPr>
-              <w:t>job.subject, job.deadline</w:t>
+                <w:rFonts w:ascii="맑은 고딕" w:hAnsi="맑은 고딕" w:eastAsia="맑은 고딕"/>
+              </w:rPr>
+              <w:t>열었으면 닫는다</w:t>
             </w:r>
           </w:p>
         </w:tc>
@@ -11545,25 +14740,7 @@
       <w:tr>
         <w:tc>
           <w:tcPr>
-            <w:tcW w:type="dxa" w:w="1984"/>
-          </w:tcPr>
-          <w:p>
-            <w:pPr>
-              <w:spacing w:before="40" w:after="40" w:line="312" w:lineRule="auto"/>
-            </w:pPr>
-            <w:r/>
-            <w:r>
-              <w:rPr>
-                <w:sz w:val="19"/>
-                <w:rFonts w:ascii="Consolas" w:hAnsi="Consolas" w:eastAsia="Consolas"/>
-              </w:rPr>
-              <w:t>sender.항목</w:t>
-            </w:r>
-          </w:p>
-        </w:tc>
-        <w:tc>
-          <w:tcPr>
-            <w:tcW w:type="dxa" w:w="3402"/>
+            <w:tcW w:type="dxa" w:w="2948"/>
           </w:tcPr>
           <w:p>
             <w:pPr>
@@ -11575,13 +14752,13 @@
                 <w:sz w:val="19"/>
                 <w:rFonts w:ascii="맑은 고딕" w:hAnsi="맑은 고딕" w:eastAsia="맑은 고딕"/>
               </w:rPr>
-              <w:t>SENDER 정보</w:t>
-            </w:r>
-          </w:p>
-        </w:tc>
-        <w:tc>
-          <w:tcPr>
-            <w:tcW w:type="dxa" w:w="4252"/>
+              <w:t>오류 메일: SyntaxError / ReferenceError</w:t>
+            </w:r>
+          </w:p>
+        </w:tc>
+        <w:tc>
+          <w:tcPr>
+            <w:tcW w:type="dxa" w:w="3402"/>
           </w:tcPr>
           <w:p>
             <w:pPr>
@@ -11591,9 +14768,27 @@
             <w:r>
               <w:rPr>
                 <w:sz w:val="19"/>
-                <w:rFonts w:ascii="Consolas" w:hAnsi="Consolas" w:eastAsia="Consolas"/>
-              </w:rPr>
-              <w:t>sender.name</w:t>
+                <w:rFonts w:ascii="맑은 고딕" w:hAnsi="맑은 고딕" w:eastAsia="맑은 고딕"/>
+              </w:rPr>
+              <w:t>&lt;? } ?&gt; 누락, 또는 값 이름 오타 (links.attach1 → link.attach1)</w:t>
+            </w:r>
+          </w:p>
+        </w:tc>
+        <w:tc>
+          <w:tcPr>
+            <w:tcW w:type="dxa" w:w="3288"/>
+          </w:tcPr>
+          <w:p>
+            <w:pPr>
+              <w:spacing w:before="40" w:after="40" w:line="312" w:lineRule="auto"/>
+            </w:pPr>
+            <w:r/>
+            <w:r>
+              <w:rPr>
+                <w:sz w:val="19"/>
+                <w:rFonts w:ascii="맑은 고딕" w:hAnsi="맑은 고딕" w:eastAsia="맑은 고딕"/>
+              </w:rPr>
+              <w:t>Config.gs 의 이름과 정확히 맞춘다. 8장 참고</w:t>
             </w:r>
           </w:p>
         </w:tc>
@@ -11625,288 +14820,176 @@
           <w:sz w:val="24"/>
           <w:rFonts w:ascii="맑은 고딕" w:hAnsi="맑은 고딕" w:eastAsia="맑은 고딕"/>
         </w:rPr>
-        <w:t>■ 7-3. 지켜야 할 규칙</w:t>
-      </w:r>
-    </w:p>
-    <w:tbl>
-      <w:tblPr>
-        <w:tblStyle w:val="TableGrid"/>
-        <w:tblW w:type="auto" w:w="0"/>
-        <w:jc w:val="left"/>
-        <w:tblLayout w:type="fixed"/>
-        <w:tblLook w:firstColumn="1" w:firstRow="1" w:lastColumn="0" w:lastRow="0" w:noHBand="0" w:noVBand="1" w:val="04A0"/>
-        <w:tblLayout w:type="fixed"/>
-      </w:tblPr>
-      <w:tblGrid>
-        <w:gridCol w:w="4986"/>
-        <w:gridCol w:w="4986"/>
-      </w:tblGrid>
-      <w:tr>
-        <w:tc>
-          <w:tcPr>
-            <w:tcW w:type="dxa" w:w="3402"/>
-            <w:shd w:val="clear" w:color="auto" w:fill="1E3A5F"/>
-          </w:tcPr>
-          <w:p>
-            <w:pPr>
-              <w:spacing w:before="60" w:after="60" w:line="300" w:lineRule="auto"/>
-            </w:pPr>
-            <w:r/>
-            <w:r>
-              <w:rPr>
-                <w:b/>
-                <w:color w:val="FFFFFF"/>
-                <w:sz w:val="20"/>
-                <w:rFonts w:ascii="맑은 고딕" w:hAnsi="맑은 고딕" w:eastAsia="맑은 고딕"/>
-              </w:rPr>
-              <w:t>규칙</w:t>
-            </w:r>
-          </w:p>
-        </w:tc>
-        <w:tc>
-          <w:tcPr>
-            <w:tcW w:type="dxa" w:w="6236"/>
-            <w:shd w:val="clear" w:color="auto" w:fill="1E3A5F"/>
-          </w:tcPr>
-          <w:p>
-            <w:pPr>
-              <w:spacing w:before="60" w:after="60" w:line="300" w:lineRule="auto"/>
-            </w:pPr>
-            <w:r/>
-            <w:r>
-              <w:rPr>
-                <w:b/>
-                <w:color w:val="FFFFFF"/>
-                <w:sz w:val="20"/>
-                <w:rFonts w:ascii="맑은 고딕" w:hAnsi="맑은 고딕" w:eastAsia="맑은 고딕"/>
-              </w:rPr>
-              <w:t>이유</w:t>
-            </w:r>
-          </w:p>
-        </w:tc>
-      </w:tr>
-      <w:tr>
-        <w:tc>
-          <w:tcPr>
-            <w:tcW w:type="dxa" w:w="3402"/>
-          </w:tcPr>
-          <w:p>
-            <w:pPr>
-              <w:spacing w:before="40" w:after="40" w:line="312" w:lineRule="auto"/>
-            </w:pPr>
-            <w:r/>
-            <w:r>
-              <w:rPr>
-                <w:sz w:val="19"/>
-                <w:rFonts w:ascii="맑은 고딕" w:hAnsi="맑은 고딕" w:eastAsia="맑은 고딕"/>
-              </w:rPr>
-              <w:t>스타일은 style="…" 로 태그에 직접(인라인)</w:t>
-            </w:r>
-          </w:p>
-        </w:tc>
-        <w:tc>
-          <w:tcPr>
-            <w:tcW w:type="dxa" w:w="6236"/>
-          </w:tcPr>
-          <w:p>
-            <w:pPr>
-              <w:spacing w:before="40" w:after="40" w:line="312" w:lineRule="auto"/>
-            </w:pPr>
-            <w:r/>
-            <w:r>
-              <w:rPr>
-                <w:sz w:val="19"/>
-                <w:rFonts w:ascii="맑은 고딕" w:hAnsi="맑은 고딕" w:eastAsia="맑은 고딕"/>
-              </w:rPr>
-              <w:t>Outlook 등 사내 메일 프로그램은 &lt;style&gt; 블록을 무시하는 경우가 많다</w:t>
-            </w:r>
-          </w:p>
-        </w:tc>
-      </w:tr>
-      <w:tr>
-        <w:tc>
-          <w:tcPr>
-            <w:tcW w:type="dxa" w:w="3402"/>
-            <w:shd w:val="clear" w:color="auto" w:fill="F2F5F8"/>
-          </w:tcPr>
-          <w:p>
-            <w:pPr>
-              <w:spacing w:before="40" w:after="40" w:line="312" w:lineRule="auto"/>
-            </w:pPr>
-            <w:r/>
-            <w:r>
-              <w:rPr>
-                <w:sz w:val="19"/>
-                <w:rFonts w:ascii="맑은 고딕" w:hAnsi="맑은 고딕" w:eastAsia="맑은 고딕"/>
-              </w:rPr>
-              <w:t>주석은 &lt;? /* … */ ?&gt;</w:t>
-            </w:r>
-          </w:p>
-        </w:tc>
-        <w:tc>
-          <w:tcPr>
-            <w:tcW w:type="dxa" w:w="6236"/>
-            <w:shd w:val="clear" w:color="auto" w:fill="F2F5F8"/>
-          </w:tcPr>
-          <w:p>
-            <w:pPr>
-              <w:spacing w:before="40" w:after="40" w:line="312" w:lineRule="auto"/>
-            </w:pPr>
-            <w:r/>
-            <w:r>
-              <w:rPr>
-                <w:sz w:val="19"/>
-                <w:rFonts w:ascii="맑은 고딕" w:hAnsi="맑은 고딕" w:eastAsia="맑은 고딕"/>
-              </w:rPr>
-              <w:t>&lt;!-- --&gt; 주석은 메일 원본에 그대로 실려 나간다. 그 안에 &lt;?= ?&gt; 가 있으면 실행되어 오류도 난다</w:t>
-            </w:r>
-          </w:p>
-        </w:tc>
-      </w:tr>
-      <w:tr>
-        <w:tc>
-          <w:tcPr>
-            <w:tcW w:type="dxa" w:w="3402"/>
-          </w:tcPr>
-          <w:p>
-            <w:pPr>
-              <w:spacing w:before="40" w:after="40" w:line="312" w:lineRule="auto"/>
-            </w:pPr>
-            <w:r/>
-            <w:r>
-              <w:rPr>
-                <w:sz w:val="19"/>
-                <w:rFonts w:ascii="맑은 고딕" w:hAnsi="맑은 고딕" w:eastAsia="맑은 고딕"/>
-              </w:rPr>
-              <w:t>&gt;, &lt; 는 &amp;gt; &amp;lt; 로</w:t>
-            </w:r>
-          </w:p>
-        </w:tc>
-        <w:tc>
-          <w:tcPr>
-            <w:tcW w:type="dxa" w:w="6236"/>
-          </w:tcPr>
-          <w:p>
-            <w:pPr>
-              <w:spacing w:before="40" w:after="40" w:line="312" w:lineRule="auto"/>
-            </w:pPr>
-            <w:r/>
-            <w:r>
-              <w:rPr>
-                <w:sz w:val="19"/>
-                <w:rFonts w:ascii="맑은 고딕" w:hAnsi="맑은 고딕" w:eastAsia="맑은 고딕"/>
-              </w:rPr>
-              <w:t>본문 글자에 꺾쇠를 그대로 쓰면 태그로 오인될 수 있다</w:t>
-            </w:r>
-          </w:p>
-        </w:tc>
-      </w:tr>
-      <w:tr>
-        <w:tc>
-          <w:tcPr>
-            <w:tcW w:type="dxa" w:w="3402"/>
-            <w:shd w:val="clear" w:color="auto" w:fill="F2F5F8"/>
-          </w:tcPr>
-          <w:p>
-            <w:pPr>
-              <w:spacing w:before="40" w:after="40" w:line="312" w:lineRule="auto"/>
-            </w:pPr>
-            <w:r/>
-            <w:r>
-              <w:rPr>
-                <w:sz w:val="19"/>
-                <w:rFonts w:ascii="맑은 고딕" w:hAnsi="맑은 고딕" w:eastAsia="맑은 고딕"/>
-              </w:rPr>
-              <w:t>글꼴·서명은 본문에 쓰지 않기</w:t>
-            </w:r>
-          </w:p>
-        </w:tc>
-        <w:tc>
-          <w:tcPr>
-            <w:tcW w:type="dxa" w:w="6236"/>
-            <w:shd w:val="clear" w:color="auto" w:fill="F2F5F8"/>
-          </w:tcPr>
-          <w:p>
-            <w:pPr>
-              <w:spacing w:before="40" w:after="40" w:line="312" w:lineRule="auto"/>
-            </w:pPr>
-            <w:r/>
-            <w:r>
-              <w:rPr>
-                <w:sz w:val="19"/>
-                <w:rFonts w:ascii="맑은 고딕" w:hAnsi="맑은 고딕" w:eastAsia="맑은 고딕"/>
-              </w:rPr>
-              <w:t>layout.html / signature.html 이 자동으로 붙여 준다</w:t>
-            </w:r>
-          </w:p>
-        </w:tc>
-      </w:tr>
-      <w:tr>
-        <w:tc>
-          <w:tcPr>
-            <w:tcW w:type="dxa" w:w="3402"/>
-          </w:tcPr>
-          <w:p>
-            <w:pPr>
-              <w:spacing w:before="40" w:after="40" w:line="312" w:lineRule="auto"/>
-            </w:pPr>
-            <w:r/>
-            <w:r>
-              <w:rPr>
-                <w:sz w:val="19"/>
-                <w:rFonts w:ascii="맑은 고딕" w:hAnsi="맑은 고딕" w:eastAsia="맑은 고딕"/>
-              </w:rPr>
-              <w:t>링크는 항상 linkHtml 로</w:t>
-            </w:r>
-          </w:p>
-        </w:tc>
-        <w:tc>
-          <w:tcPr>
-            <w:tcW w:type="dxa" w:w="6236"/>
-          </w:tcPr>
-          <w:p>
-            <w:pPr>
-              <w:spacing w:before="40" w:after="40" w:line="312" w:lineRule="auto"/>
-            </w:pPr>
-            <w:r/>
-            <w:r>
-              <w:rPr>
-                <w:sz w:val="19"/>
-                <w:rFonts w:ascii="맑은 고딕" w:hAnsi="맑은 고딕" w:eastAsia="맑은 고딕"/>
-              </w:rPr>
-              <w:t>색이 통일되고, 빈 링크가 자동 검출된다</w:t>
-            </w:r>
-          </w:p>
-        </w:tc>
-      </w:tr>
-    </w:tbl>
-    <w:p>
-      <w:pPr>
-        <w:spacing w:before="0" w:after="120" w:line="240" w:lineRule="auto"/>
-      </w:pPr>
-      <w:r>
-        <w:rPr>
-          <w:sz w:val="2"/>
-          <w:rFonts w:ascii="맑은 고딕" w:hAnsi="맑은 고딕" w:eastAsia="맑은 고딕"/>
-        </w:rPr>
+        <w:t>■ 7-9. 새 본문을 만드는 순서 (5단계)</w:t>
       </w:r>
     </w:p>
     <w:p>
       <w:pPr>
-        <w:pStyle w:val="Heading2"/>
-        <w:spacing w:before="280" w:after="100" w:line="312" w:lineRule="auto"/>
-        <w:pBdr>
-          <w:bottom w:val="single" w:sz="4" w:space="3" w:color="C9D2DC"/>
-        </w:pBdr>
+        <w:spacing w:after="60"/>
+        <w:ind w:left="283" w:hanging="283"/>
       </w:pPr>
       <w:r>
         <w:rPr>
           <w:b/>
           <w:color w:val="0F5C8C"/>
-          <w:sz w:val="24"/>
-          <w:rFonts w:ascii="맑은 고딕" w:hAnsi="맑은 고딕" w:eastAsia="맑은 고딕"/>
-        </w:rPr>
-        <w:t>■ 7-4. 자주 쓰는 서식 조각</w:t>
+          <w:sz w:val="22"/>
+          <w:rFonts w:ascii="맑은 고딕" w:hAnsi="맑은 고딕" w:eastAsia="맑은 고딕"/>
+        </w:rPr>
+        <w:t xml:space="preserve">① </w:t>
+      </w:r>
+      <w:r>
+        <w:rPr>
+          <w:sz w:val="21"/>
+          <w:rFonts w:ascii="맑은 고딕" w:hAnsi="맑은 고딕" w:eastAsia="맑은 고딕"/>
+        </w:rPr>
+        <w:t>기존 mail_svc_tag.html 을 복사해서 새 HTML 파일을 만든다. (파일 이름 예: mail_monthly_tool)</w:t>
+      </w:r>
+    </w:p>
+    <w:p>
+      <w:pPr>
+        <w:spacing w:after="60"/>
+        <w:ind w:left="283" w:hanging="283"/>
+      </w:pPr>
+      <w:r>
+        <w:rPr>
+          <w:b/>
+          <w:color w:val="0F5C8C"/>
+          <w:sz w:val="22"/>
+          <w:rFonts w:ascii="맑은 고딕" w:hAnsi="맑은 고딕" w:eastAsia="맑은 고딕"/>
+        </w:rPr>
+        <w:t xml:space="preserve">② </w:t>
+      </w:r>
+      <w:r>
+        <w:rPr>
+          <w:sz w:val="21"/>
+          <w:rFonts w:ascii="맑은 고딕" w:hAnsi="맑은 고딕" w:eastAsia="맑은 고딕"/>
+        </w:rPr>
+        <w:t>맨 위 주석 아래의 본문만 새 내용으로 바꾼다. 줄 끝마다 &lt;br&gt;, 계층은 &lt;div style="margin-left: 20px;"&gt; 로 맞춘다.</w:t>
+      </w:r>
+    </w:p>
+    <w:p>
+      <w:pPr>
+        <w:spacing w:after="60"/>
+        <w:ind w:left="283" w:hanging="283"/>
+      </w:pPr>
+      <w:r>
+        <w:rPr>
+          <w:b/>
+          <w:color w:val="0F5C8C"/>
+          <w:sz w:val="22"/>
+          <w:rFonts w:ascii="맑은 고딕" w:hAnsi="맑은 고딕" w:eastAsia="맑은 고딕"/>
+        </w:rPr>
+        <w:t xml:space="preserve">③ </w:t>
+      </w:r>
+      <w:r>
+        <w:rPr>
+          <w:sz w:val="21"/>
+          <w:rFonts w:ascii="맑은 고딕" w:hAnsi="맑은 고딕" w:eastAsia="맑은 고딕"/>
+        </w:rPr>
+        <w:t>날짜는 &lt;?= vars.date ?&gt;, 링크는 &lt;?!= linkHtml(links.이름, '링크') ?&gt; 로 쓴다.</w:t>
+      </w:r>
+    </w:p>
+    <w:p>
+      <w:pPr>
+        <w:spacing w:after="60"/>
+        <w:ind w:left="283" w:hanging="283"/>
+      </w:pPr>
+      <w:r>
+        <w:rPr>
+          <w:b/>
+          <w:color w:val="0F5C8C"/>
+          <w:sz w:val="22"/>
+          <w:rFonts w:ascii="맑은 고딕" w:hAnsi="맑은 고딕" w:eastAsia="맑은 고딕"/>
+        </w:rPr>
+        <w:t xml:space="preserve">④ </w:t>
+      </w:r>
+      <w:r>
+        <w:rPr>
+          <w:sz w:val="21"/>
+          <w:rFonts w:ascii="맑은 고딕" w:hAnsi="맑은 고딕" w:eastAsia="맑은 고딕"/>
+        </w:rPr>
+        <w:t>Config.gs 의 메일 묶음에 template: 'mail_monthly_tool' 과 links 를 적는다.</w:t>
+      </w:r>
+    </w:p>
+    <w:p>
+      <w:pPr>
+        <w:spacing w:after="60"/>
+        <w:ind w:left="283" w:hanging="283"/>
+      </w:pPr>
+      <w:r>
+        <w:rPr>
+          <w:b/>
+          <w:color w:val="0F5C8C"/>
+          <w:sz w:val="22"/>
+          <w:rFonts w:ascii="맑은 고딕" w:hAnsi="맑은 고딕" w:eastAsia="맑은 고딕"/>
+        </w:rPr>
+        <w:t xml:space="preserve">⑤ </w:t>
+      </w:r>
+      <w:r>
+        <w:rPr>
+          <w:sz w:val="21"/>
+          <w:rFonts w:ascii="맑은 고딕" w:hAnsi="맑은 고딕" w:eastAsia="맑은 고딕"/>
+        </w:rPr>
+        <w:t>TEST_JOB_ID 를 새 메일의 id 로 바꾸고 testSendToMe 를 실행해, 받은 메일을 그림 8처럼 코드와 비교해 본다.</w:t>
+      </w:r>
+    </w:p>
+    <w:p>
+      <w:pPr>
+        <w:spacing w:before="160" w:after="0" w:line="336" w:lineRule="auto"/>
+        <w:ind w:left="142" w:right="57"/>
+        <w:shd w:val="clear" w:color="auto" w:fill="FDF1E7"/>
+        <w:pBdr>
+          <w:left w:val="single" w:sz="20" w:space="6" w:color="B32020"/>
+        </w:pBdr>
+      </w:pPr>
+      <w:r>
+        <w:rPr>
+          <w:b/>
+          <w:color w:val="B32020"/>
+          <w:sz w:val="21"/>
+          <w:rFonts w:ascii="맑은 고딕" w:hAnsi="맑은 고딕" w:eastAsia="맑은 고딕"/>
+        </w:rPr>
+        <w:t xml:space="preserve">※ </w:t>
+      </w:r>
+      <w:r>
+        <w:rPr>
+          <w:b/>
+          <w:color w:val="B32020"/>
+          <w:sz w:val="21"/>
+          <w:rFonts w:ascii="맑은 고딕" w:hAnsi="맑은 고딕" w:eastAsia="맑은 고딕"/>
+        </w:rPr>
+        <w:t xml:space="preserve">그림과 실제 메일은 100% 같지 않을 수 있습니다  </w:t>
+      </w:r>
+      <w:r>
+        <w:rPr>
+          <w:sz w:val="20"/>
+          <w:rFonts w:ascii="맑은 고딕" w:hAnsi="맑은 고딕" w:eastAsia="맑은 고딕"/>
+        </w:rPr>
+        <w:t>이 장의 오른쪽 그림은 크롬 브라우저로 그린 것입니다. Gmail 과 거의 같게 보이지만, Outlook 같은 프로그램은 들여쓰기·표 모양이 조금 다를 수 있습니다.</w:t>
+      </w:r>
+    </w:p>
+    <w:p>
+      <w:pPr>
+        <w:spacing w:before="0" w:after="160" w:line="336" w:lineRule="auto"/>
+        <w:ind w:left="142" w:right="57"/>
+        <w:shd w:val="clear" w:color="auto" w:fill="FDF1E7"/>
+        <w:pBdr>
+          <w:left w:val="single" w:sz="20" w:space="6" w:color="B32020"/>
+        </w:pBdr>
+      </w:pPr>
+      <w:r>
+        <w:rPr>
+          <w:sz w:val="21"/>
+          <w:rFonts w:ascii="맑은 고딕" w:hAnsi="맑은 고딕" w:eastAsia="맑은 고딕"/>
+        </w:rPr>
+        <w:t xml:space="preserve">   </w:t>
+      </w:r>
+      <w:r>
+        <w:rPr>
+          <w:sz w:val="20"/>
+          <w:rFonts w:ascii="맑은 고딕" w:hAnsi="맑은 고딕" w:eastAsia="맑은 고딕"/>
+        </w:rPr>
+        <w:t>그래서 마지막 확인은 항상 testSendToMe 로 내 메일함에서, 실제로 쓰는 메일 프로그램으로 보는 것이 가장 정확합니다.</w:t>
       </w:r>
     </w:p>
     <w:p>
@@ -11920,7 +15003,7 @@
           <w:sz w:val="18"/>
           <w:rFonts w:ascii="맑은 고딕" w:hAnsi="맑은 고딕" w:eastAsia="맑은 고딕"/>
         </w:rPr>
-        <w:t>복사해서 쓰는 HTML</w:t>
+        <w:t>복사해서 쓰는 HTML 조각 모음</w:t>
       </w:r>
     </w:p>
     <w:p>
@@ -11988,7 +15071,7 @@
           <w:sz w:val="19"/>
           <w:rFonts w:ascii="Consolas" w:hAnsi="Consolas" w:eastAsia="Consolas"/>
         </w:rPr>
-        <w:t>&lt;div style="margin-left: 40px;"&gt; 두 단계 들여쓰기 &lt;/div&gt;</w:t>
+        <w:t>줄바꿈&lt;br&gt;</w:t>
       </w:r>
     </w:p>
     <w:p>
@@ -12005,7 +15088,24 @@
           <w:sz w:val="19"/>
           <w:rFonts w:ascii="Consolas" w:hAnsi="Consolas" w:eastAsia="Consolas"/>
         </w:rPr>
-        <w:t>줄바꿈&lt;br&gt;</w:t>
+        <w:t>시트 이름: &lt;?= vars.date ?&gt;&lt;br&gt;</w:t>
+      </w:r>
+    </w:p>
+    <w:p>
+      <w:pPr>
+        <w:spacing w:before="0" w:after="0" w:line="300" w:lineRule="auto"/>
+        <w:ind w:left="170"/>
+        <w:shd w:val="clear" w:color="auto" w:fill="F4F4F5"/>
+        <w:pBdr>
+          <w:left w:val="single" w:sz="12" w:space="6" w:color="C9D2DC"/>
+        </w:pBdr>
+      </w:pPr>
+      <w:r>
+        <w:rPr>
+          <w:sz w:val="19"/>
+          <w:rFonts w:ascii="Consolas" w:hAnsi="Consolas" w:eastAsia="Consolas"/>
+        </w:rPr>
+        <w:t>첨부 (&lt;?!= linkHtml(links.sheet, '링크') ?&gt;)&lt;br&gt;</w:t>
       </w:r>
     </w:p>
     <w:p>
@@ -12022,7 +15122,7 @@
           <w:sz w:val="19"/>
           <w:rFonts w:ascii="Consolas" w:hAnsi="Consolas" w:eastAsia="Consolas"/>
         </w:rPr>
-        <w:t>&lt;? if (job.deadline) { ?&gt; 기한: &lt;?= job.deadline ?&gt;&lt;br&gt; &lt;? } ?&gt;   // 값이 있을 때만 표시</w:t>
+        <w:t>&lt;? if (job.deadline) { ?&gt; 기한: &lt;?= job.deadline ?&gt;&lt;br&gt; &lt;? } ?&gt;</w:t>
       </w:r>
     </w:p>
     <w:p>

</xml_diff>